<commit_message>
more quality resume samples added
</commit_message>
<xml_diff>
--- a/Resume/network engr resume - aesthetic blue - a4.docx
+++ b/Resume/network engr resume - aesthetic blue - a4.docx
@@ -433,7 +433,7 @@
               <mc:AlternateContent>
                 <mc:Choice Requires="wps">
                   <w:drawing>
-                    <wp:anchor distT="0" distB="0" distL="114300" distR="114300" simplePos="0" relativeHeight="251675648" behindDoc="0" locked="0" layoutInCell="1" allowOverlap="1" wp14:anchorId="60F2F096" wp14:editId="31FAB6AE">
+                    <wp:anchor distT="0" distB="0" distL="114300" distR="114300" simplePos="0" relativeHeight="251675648" behindDoc="0" locked="0" layoutInCell="1" allowOverlap="1" wp14:anchorId="60F2F096" wp14:editId="169DE545">
                       <wp:simplePos x="0" y="0"/>
                       <wp:positionH relativeFrom="column">
                         <wp:posOffset>-144941</wp:posOffset>
@@ -444,7 +444,13 @@
                       <wp:extent cx="7113280" cy="0"/>
                       <wp:effectExtent l="0" t="19050" r="49530" b="38100"/>
                       <wp:wrapNone/>
-                      <wp:docPr id="2127625352" name="Straight Connector 32"/>
+                      <wp:docPr id="2127625352" name="Straight Connector 32">
+                        <a:extLst xmlns:a="http://schemas.openxmlformats.org/drawingml/2006/main">
+                          <a:ext uri="{C183D7F6-B498-43B3-948B-1728B52AA6E4}">
+                            <adec:decorative xmlns:adec="http://schemas.microsoft.com/office/drawing/2017/decorative" val="1"/>
+                          </a:ext>
+                        </a:extLst>
+                      </wp:docPr>
                       <wp:cNvGraphicFramePr/>
                       <a:graphic xmlns:a="http://schemas.openxmlformats.org/drawingml/2006/main">
                         <a:graphicData uri="http://schemas.microsoft.com/office/word/2010/wordprocessingShape">
@@ -493,7 +499,7 @@
                 </mc:Choice>
                 <mc:Fallback>
                   <w:pict>
-                    <v:line w14:anchorId="290B8699" id="Straight Connector 32" o:spid="_x0000_s1026" style="position:absolute;z-index:251675648;visibility:visible;mso-wrap-style:square;mso-width-percent:0;mso-height-percent:0;mso-wrap-distance-left:9pt;mso-wrap-distance-top:0;mso-wrap-distance-right:9pt;mso-wrap-distance-bottom:0;mso-position-horizontal:absolute;mso-position-horizontal-relative:text;mso-position-vertical:absolute;mso-position-vertical-relative:text;mso-width-percent:0;mso-height-percent:0;mso-width-relative:margin;mso-height-relative:margin" from="-11.4pt,.5pt" to="548.7pt,.5pt" o:gfxdata="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" strokecolor="#1588cf" strokeweight="3.75pt">
+                    <v:line w14:anchorId="5E8E39D2" id="Straight Connector 32" o:spid="_x0000_s1026" alt="&quot;&quot;" style="position:absolute;z-index:251675648;visibility:visible;mso-wrap-style:square;mso-width-percent:0;mso-height-percent:0;mso-wrap-distance-left:9pt;mso-wrap-distance-top:0;mso-wrap-distance-right:9pt;mso-wrap-distance-bottom:0;mso-position-horizontal:absolute;mso-position-horizontal-relative:text;mso-position-vertical:absolute;mso-position-vertical-relative:text;mso-width-percent:0;mso-height-percent:0;mso-width-relative:margin;mso-height-relative:margin" from="-11.4pt,.5pt" to="548.7pt,.5pt" o:gfxdata="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" strokecolor="#1588cf" strokeweight="3.75pt">
                       <v:stroke linestyle="thinThick" joinstyle="miter"/>
                     </v:line>
                   </w:pict>
@@ -545,7 +551,18 @@
                 <w:sz w:val="28"/>
                 <w:szCs w:val="28"/>
               </w:rPr>
-              <w:t>Education</w:t>
+              <w:t xml:space="preserve">Professional </w:t>
+            </w:r>
+            <w:r>
+              <w:rPr>
+                <w:rFonts w:ascii="Playfair Display" w:hAnsi="Playfair Display" w:cs="Times New Roman (Body CS)"/>
+                <w:b/>
+                <w:bCs/>
+                <w:color w:val="1588CF"/>
+                <w:sz w:val="28"/>
+                <w:szCs w:val="28"/>
+              </w:rPr>
+              <w:t>Experience</w:t>
             </w:r>
           </w:p>
           <w:p>
@@ -569,18 +586,24 @@
               <mc:AlternateContent>
                 <mc:Choice Requires="wps">
                   <w:drawing>
-                    <wp:anchor distT="0" distB="0" distL="114300" distR="114300" simplePos="0" relativeHeight="251659264" behindDoc="0" locked="0" layoutInCell="1" allowOverlap="1" wp14:anchorId="445A68BE" wp14:editId="36A10275">
+                    <wp:anchor distT="0" distB="0" distL="114300" distR="114300" simplePos="0" relativeHeight="251682816" behindDoc="0" locked="0" layoutInCell="1" allowOverlap="1" wp14:anchorId="51E96544" wp14:editId="427153AB">
                       <wp:simplePos x="0" y="0"/>
                       <wp:positionH relativeFrom="column">
-                        <wp:posOffset>-132876</wp:posOffset>
+                        <wp:posOffset>-132554</wp:posOffset>
                       </wp:positionH>
                       <wp:positionV relativeFrom="paragraph">
-                        <wp:posOffset>46355</wp:posOffset>
+                        <wp:posOffset>85090</wp:posOffset>
                       </wp:positionV>
                       <wp:extent cx="7092000" cy="0"/>
                       <wp:effectExtent l="0" t="19050" r="33020" b="19050"/>
                       <wp:wrapNone/>
-                      <wp:docPr id="1103464770" name="Straight Connector 32"/>
+                      <wp:docPr id="2018724291" name="Straight Connector 32">
+                        <a:extLst xmlns:a="http://schemas.openxmlformats.org/drawingml/2006/main">
+                          <a:ext uri="{C183D7F6-B498-43B3-948B-1728B52AA6E4}">
+                            <adec:decorative xmlns:adec="http://schemas.microsoft.com/office/drawing/2017/decorative" val="1"/>
+                          </a:ext>
+                        </a:extLst>
+                      </wp:docPr>
                       <wp:cNvGraphicFramePr/>
                       <a:graphic xmlns:a="http://schemas.openxmlformats.org/drawingml/2006/main">
                         <a:graphicData uri="http://schemas.microsoft.com/office/word/2010/wordprocessingShape">
@@ -626,7 +649,7 @@
                 </mc:Choice>
                 <mc:Fallback>
                   <w:pict>
-                    <v:line w14:anchorId="65B98542" id="Straight Connector 32" o:spid="_x0000_s1026" style="position:absolute;z-index:251659264;visibility:visible;mso-wrap-style:square;mso-width-percent:0;mso-wrap-distance-left:9pt;mso-wrap-distance-top:0;mso-wrap-distance-right:9pt;mso-wrap-distance-bottom:0;mso-position-horizontal:absolute;mso-position-horizontal-relative:text;mso-position-vertical:absolute;mso-position-vertical-relative:text;mso-width-percent:0;mso-width-relative:margin" from="-10.45pt,3.65pt" to="548pt,3.65pt" o:gfxdata="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" strokecolor="#cbcfd4" strokeweight="3pt">
+                    <v:line w14:anchorId="07110F1C" id="Straight Connector 32" o:spid="_x0000_s1026" alt="&quot;&quot;" style="position:absolute;z-index:251682816;visibility:visible;mso-wrap-style:square;mso-width-percent:0;mso-wrap-distance-left:9pt;mso-wrap-distance-top:0;mso-wrap-distance-right:9pt;mso-wrap-distance-bottom:0;mso-position-horizontal:absolute;mso-position-horizontal-relative:text;mso-position-vertical:absolute;mso-position-vertical-relative:text;mso-width-percent:0;mso-width-relative:margin" from="-10.45pt,6.7pt" to="548pt,6.7pt" o:gfxdata="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" strokecolor="#cbcfd4" strokeweight="3pt">
                       <v:stroke joinstyle="miter"/>
                     </v:line>
                   </w:pict>
@@ -636,7 +659,7 @@
           </w:p>
           <w:p>
             <w:pPr>
-              <w:spacing w:line="360" w:lineRule="auto"/>
+              <w:spacing w:line="300" w:lineRule="auto"/>
               <w:rPr>
                 <w:rFonts w:ascii="Inter 18pt 18pt SemiBold" w:hAnsi="Inter 18pt 18pt SemiBold"/>
                 <w:b/>
@@ -651,189 +674,471 @@
                 <w:bCs/>
                 <w:color w:val="24272E"/>
               </w:rPr>
-              <w:t>BE</w:t>
-            </w:r>
-            <w:r>
-              <w:rPr>
-                <w:rFonts w:ascii="Inter 18pt 18pt SemiBold" w:hAnsi="Inter 18pt 18pt SemiBold"/>
+              <w:t xml:space="preserve">NETWORKING AND TELECOMMUNICATIONS ENGINEER </w:t>
+            </w:r>
+          </w:p>
+          <w:p>
+            <w:pPr>
+              <w:rPr>
+                <w:rFonts w:ascii="Inter 18pt 18pt" w:hAnsi="Inter 18pt 18pt"/>
+                <w:color w:val="656B72"/>
+                <w:sz w:val="20"/>
+                <w:szCs w:val="20"/>
+              </w:rPr>
+            </w:pPr>
+            <w:r>
+              <w:rPr>
+                <w:rFonts w:ascii="Inter 18pt 18pt" w:hAnsi="Inter 18pt 18pt"/>
+                <w:sz w:val="20"/>
+                <w:szCs w:val="20"/>
+              </w:rPr>
+              <w:t>Pakistan Air Force</w:t>
+            </w:r>
+            <w:r>
+              <w:rPr>
+                <w:rFonts w:ascii="Inter 18pt 18pt" w:hAnsi="Inter 18pt 18pt"/>
+                <w:sz w:val="20"/>
+                <w:szCs w:val="20"/>
+              </w:rPr>
+              <w:t xml:space="preserve"> | </w:t>
+            </w:r>
+            <w:r>
+              <w:rPr>
+                <w:rFonts w:ascii="Inter 18pt 18pt" w:hAnsi="Inter 18pt 18pt"/>
+                <w:color w:val="656B72"/>
+                <w:sz w:val="20"/>
+                <w:szCs w:val="20"/>
+              </w:rPr>
+              <w:t xml:space="preserve">July 2023 </w:t>
+            </w:r>
+            <w:r>
+              <w:rPr>
+                <w:rFonts w:ascii="Inter 18pt 18pt" w:hAnsi="Inter 18pt 18pt"/>
+                <w:color w:val="656B72"/>
+                <w:sz w:val="20"/>
+                <w:szCs w:val="20"/>
+              </w:rPr>
+              <w:t>– Present</w:t>
+            </w:r>
+          </w:p>
+          <w:p>
+            <w:pPr>
+              <w:rPr>
+                <w:rFonts w:ascii="Inter 18pt 18pt" w:hAnsi="Inter 18pt 18pt"/>
+                <w:sz w:val="20"/>
+                <w:szCs w:val="20"/>
+              </w:rPr>
+            </w:pPr>
+          </w:p>
+          <w:p>
+            <w:pPr>
+              <w:pStyle w:val="ListParagraph"/>
+              <w:numPr>
+                <w:ilvl w:val="0"/>
+                <w:numId w:val="1"/>
+              </w:numPr>
+              <w:snapToGrid w:val="0"/>
+              <w:spacing w:after="80"/>
+              <w:ind w:left="397" w:hanging="227"/>
+              <w:contextualSpacing w:val="0"/>
+              <w:rPr>
+                <w:rFonts w:ascii="Inter 18pt 18pt" w:hAnsi="Inter 18pt 18pt"/>
+                <w:color w:val="52575E"/>
+                <w:sz w:val="20"/>
+                <w:szCs w:val="20"/>
+              </w:rPr>
+            </w:pPr>
+            <w:r>
+              <w:rPr>
+                <w:rFonts w:ascii="Inter 18pt 18pt" w:hAnsi="Inter 18pt 18pt"/>
+                <w:color w:val="52575E"/>
+                <w:sz w:val="20"/>
+                <w:szCs w:val="20"/>
+              </w:rPr>
+              <w:t>Set</w:t>
+            </w:r>
+            <w:r>
+              <w:rPr>
+                <w:rFonts w:ascii="Inter 18pt 18pt" w:hAnsi="Inter 18pt 18pt"/>
+                <w:color w:val="52575E"/>
+                <w:sz w:val="20"/>
+                <w:szCs w:val="20"/>
+              </w:rPr>
+              <w:t xml:space="preserve"> </w:t>
+            </w:r>
+            <w:r>
+              <w:rPr>
+                <w:rFonts w:ascii="Inter 18pt 18pt" w:hAnsi="Inter 18pt 18pt"/>
+                <w:color w:val="52575E"/>
+                <w:sz w:val="20"/>
+                <w:szCs w:val="20"/>
+              </w:rPr>
+              <w:t>up and Administ</w:t>
+            </w:r>
+            <w:r>
+              <w:rPr>
+                <w:rFonts w:ascii="Inter 18pt 18pt" w:hAnsi="Inter 18pt 18pt"/>
+                <w:color w:val="52575E"/>
+                <w:sz w:val="20"/>
+                <w:szCs w:val="20"/>
+              </w:rPr>
+              <w:t xml:space="preserve">ered </w:t>
+            </w:r>
+            <w:r>
+              <w:rPr>
+                <w:rFonts w:ascii="Inter 18pt 18pt" w:hAnsi="Inter 18pt 18pt"/>
+                <w:color w:val="52575E"/>
+                <w:sz w:val="20"/>
+                <w:szCs w:val="20"/>
+              </w:rPr>
+              <w:t>Active Directory</w:t>
+            </w:r>
+          </w:p>
+          <w:p>
+            <w:pPr>
+              <w:pStyle w:val="ListParagraph"/>
+              <w:numPr>
+                <w:ilvl w:val="0"/>
+                <w:numId w:val="1"/>
+              </w:numPr>
+              <w:snapToGrid w:val="0"/>
+              <w:spacing w:after="80"/>
+              <w:ind w:left="397" w:hanging="227"/>
+              <w:contextualSpacing w:val="0"/>
+              <w:rPr>
+                <w:rFonts w:ascii="Inter 18pt 18pt" w:hAnsi="Inter 18pt 18pt"/>
+                <w:color w:val="52575E"/>
+                <w:sz w:val="20"/>
+                <w:szCs w:val="20"/>
+              </w:rPr>
+            </w:pPr>
+            <w:r>
+              <w:rPr>
+                <w:rFonts w:ascii="Inter 18pt 18pt" w:hAnsi="Inter 18pt 18pt"/>
+                <w:color w:val="52575E"/>
+                <w:sz w:val="20"/>
+                <w:szCs w:val="20"/>
+              </w:rPr>
+              <w:t>Integrat</w:t>
+            </w:r>
+            <w:r>
+              <w:rPr>
+                <w:rFonts w:ascii="Inter 18pt 18pt" w:hAnsi="Inter 18pt 18pt"/>
+                <w:color w:val="52575E"/>
+                <w:sz w:val="20"/>
+                <w:szCs w:val="20"/>
+              </w:rPr>
+              <w:t>ed</w:t>
+            </w:r>
+            <w:r>
+              <w:rPr>
+                <w:rFonts w:ascii="Inter 18pt 18pt" w:hAnsi="Inter 18pt 18pt"/>
+                <w:color w:val="52575E"/>
+                <w:sz w:val="20"/>
+                <w:szCs w:val="20"/>
+              </w:rPr>
+              <w:t xml:space="preserve"> ROIP with LTE Network</w:t>
+            </w:r>
+          </w:p>
+          <w:p>
+            <w:pPr>
+              <w:pStyle w:val="ListParagraph"/>
+              <w:numPr>
+                <w:ilvl w:val="0"/>
+                <w:numId w:val="1"/>
+              </w:numPr>
+              <w:snapToGrid w:val="0"/>
+              <w:spacing w:after="80"/>
+              <w:ind w:left="397" w:hanging="227"/>
+              <w:contextualSpacing w:val="0"/>
+              <w:rPr>
+                <w:rFonts w:ascii="Inter 18pt 18pt" w:hAnsi="Inter 18pt 18pt"/>
+                <w:color w:val="52575E"/>
+                <w:sz w:val="20"/>
+                <w:szCs w:val="20"/>
+              </w:rPr>
+            </w:pPr>
+            <w:r>
+              <w:rPr>
+                <w:rFonts w:ascii="Inter 18pt 18pt" w:hAnsi="Inter 18pt 18pt"/>
+                <w:color w:val="52575E"/>
+                <w:sz w:val="20"/>
+                <w:szCs w:val="20"/>
+              </w:rPr>
+              <w:t>Set</w:t>
+            </w:r>
+            <w:r>
+              <w:rPr>
+                <w:rFonts w:ascii="Inter 18pt 18pt" w:hAnsi="Inter 18pt 18pt"/>
+                <w:color w:val="52575E"/>
+                <w:sz w:val="20"/>
+                <w:szCs w:val="20"/>
+              </w:rPr>
+              <w:t xml:space="preserve"> </w:t>
+            </w:r>
+            <w:r>
+              <w:rPr>
+                <w:rFonts w:ascii="Inter 18pt 18pt" w:hAnsi="Inter 18pt 18pt"/>
+                <w:color w:val="52575E"/>
+                <w:sz w:val="20"/>
+                <w:szCs w:val="20"/>
+              </w:rPr>
+              <w:t>up on-premise Cloud Server (Nextcloud</w:t>
+            </w:r>
+            <w:r>
+              <w:rPr>
+                <w:rFonts w:ascii="Inter 18pt 18pt" w:hAnsi="Inter 18pt 18pt"/>
+                <w:color w:val="52575E"/>
+                <w:sz w:val="20"/>
+                <w:szCs w:val="20"/>
+              </w:rPr>
+              <w:t>)</w:t>
+            </w:r>
+          </w:p>
+          <w:p>
+            <w:pPr>
+              <w:pStyle w:val="ListParagraph"/>
+              <w:numPr>
+                <w:ilvl w:val="0"/>
+                <w:numId w:val="1"/>
+              </w:numPr>
+              <w:snapToGrid w:val="0"/>
+              <w:spacing w:after="80"/>
+              <w:ind w:left="397" w:hanging="227"/>
+              <w:contextualSpacing w:val="0"/>
+              <w:rPr>
+                <w:rFonts w:ascii="Inter 18pt 18pt" w:hAnsi="Inter 18pt 18pt"/>
+                <w:color w:val="52575E"/>
+                <w:sz w:val="20"/>
+                <w:szCs w:val="20"/>
+              </w:rPr>
+            </w:pPr>
+            <w:r>
+              <w:rPr>
+                <w:rFonts w:ascii="Inter 18pt 18pt" w:hAnsi="Inter 18pt 18pt"/>
+                <w:color w:val="52575E"/>
+                <w:sz w:val="20"/>
+                <w:szCs w:val="20"/>
+              </w:rPr>
+              <w:t>Implemented, Managed and Operated Software Define Data Centre (VMware vSphere)</w:t>
+            </w:r>
+          </w:p>
+          <w:p>
+            <w:pPr>
+              <w:pStyle w:val="ListParagraph"/>
+              <w:numPr>
+                <w:ilvl w:val="0"/>
+                <w:numId w:val="1"/>
+              </w:numPr>
+              <w:snapToGrid w:val="0"/>
+              <w:spacing w:after="80"/>
+              <w:ind w:left="397" w:hanging="227"/>
+              <w:contextualSpacing w:val="0"/>
+              <w:rPr>
+                <w:rFonts w:ascii="Inter 18pt 18pt" w:hAnsi="Inter 18pt 18pt"/>
+                <w:color w:val="52575E"/>
+                <w:sz w:val="20"/>
+                <w:szCs w:val="20"/>
+              </w:rPr>
+            </w:pPr>
+            <w:r>
+              <w:rPr>
+                <w:rFonts w:ascii="Inter 18pt 18pt" w:hAnsi="Inter 18pt 18pt"/>
+                <w:color w:val="52575E"/>
+                <w:sz w:val="20"/>
+                <w:szCs w:val="20"/>
+                <w:lang w:val="en-GB"/>
+              </w:rPr>
+              <w:t>Administered</w:t>
+            </w:r>
+            <w:r>
+              <w:rPr>
+                <w:rFonts w:ascii="Inter 18pt 18pt" w:hAnsi="Inter 18pt 18pt"/>
+                <w:color w:val="52575E"/>
+                <w:sz w:val="20"/>
+                <w:szCs w:val="20"/>
+              </w:rPr>
+              <w:t xml:space="preserve"> Next Generation Networks </w:t>
+            </w:r>
+            <w:r>
+              <w:rPr>
+                <w:rFonts w:ascii="Inter 18pt 18pt" w:hAnsi="Inter 18pt 18pt"/>
+                <w:color w:val="52575E"/>
+                <w:sz w:val="20"/>
+                <w:szCs w:val="20"/>
+              </w:rPr>
+              <w:t>(Cisco and Huawei)</w:t>
+            </w:r>
+            <w:r>
+              <w:rPr>
+                <w:rFonts w:ascii="Inter 18pt 18pt" w:hAnsi="Inter 18pt 18pt"/>
+                <w:color w:val="52575E"/>
+                <w:sz w:val="20"/>
+                <w:szCs w:val="20"/>
+              </w:rPr>
+              <w:t xml:space="preserve"> </w:t>
+            </w:r>
+            <w:r>
+              <w:rPr>
+                <w:rFonts w:ascii="Inter 18pt 18pt" w:hAnsi="Inter 18pt 18pt"/>
+                <w:color w:val="52575E"/>
+                <w:sz w:val="20"/>
+                <w:szCs w:val="20"/>
+              </w:rPr>
+              <w:t>including proactive security audit</w:t>
+            </w:r>
+            <w:r>
+              <w:rPr>
+                <w:rFonts w:ascii="Inter 18pt 18pt" w:hAnsi="Inter 18pt 18pt"/>
+                <w:color w:val="52575E"/>
+                <w:sz w:val="20"/>
+                <w:szCs w:val="20"/>
+              </w:rPr>
+              <w:t>ing</w:t>
+            </w:r>
+            <w:r>
+              <w:rPr>
+                <w:rFonts w:ascii="Inter 18pt 18pt" w:hAnsi="Inter 18pt 18pt"/>
+                <w:color w:val="52575E"/>
+                <w:sz w:val="20"/>
+                <w:szCs w:val="20"/>
+              </w:rPr>
+              <w:t xml:space="preserve"> to detect and mitigate network vulnerabilities</w:t>
+            </w:r>
+          </w:p>
+          <w:p>
+            <w:pPr>
+              <w:pStyle w:val="ListParagraph"/>
+              <w:numPr>
+                <w:ilvl w:val="0"/>
+                <w:numId w:val="1"/>
+              </w:numPr>
+              <w:snapToGrid w:val="0"/>
+              <w:spacing w:after="80"/>
+              <w:ind w:left="397" w:hanging="227"/>
+              <w:contextualSpacing w:val="0"/>
+              <w:rPr>
+                <w:rFonts w:ascii="Inter 18pt 18pt" w:hAnsi="Inter 18pt 18pt"/>
+                <w:color w:val="52575E"/>
+                <w:sz w:val="20"/>
+                <w:szCs w:val="20"/>
+              </w:rPr>
+            </w:pPr>
+            <w:r>
+              <w:rPr>
+                <w:rFonts w:ascii="Inter 18pt 18pt" w:hAnsi="Inter 18pt 18pt"/>
+                <w:color w:val="52575E"/>
+                <w:sz w:val="20"/>
+                <w:szCs w:val="20"/>
+                <w:lang w:val="en-GB"/>
+              </w:rPr>
+              <w:t>Administered</w:t>
+            </w:r>
+            <w:r>
+              <w:rPr>
+                <w:rFonts w:ascii="Inter 18pt 18pt" w:hAnsi="Inter 18pt 18pt"/>
+                <w:color w:val="52575E"/>
+                <w:sz w:val="20"/>
+                <w:szCs w:val="20"/>
+              </w:rPr>
+              <w:t xml:space="preserve"> POTS and IPX Systems </w:t>
+            </w:r>
+            <w:r>
+              <w:rPr>
+                <w:rFonts w:ascii="Inter 18pt 18pt" w:hAnsi="Inter 18pt 18pt"/>
+                <w:color w:val="52575E"/>
+                <w:sz w:val="20"/>
+                <w:szCs w:val="20"/>
+              </w:rPr>
+              <w:t xml:space="preserve">featuring Huawei infrastructure including firewall, </w:t>
+            </w:r>
+            <w:r>
+              <w:rPr>
+                <w:rFonts w:ascii="Inter 18pt 18pt" w:hAnsi="Inter 18pt 18pt"/>
+                <w:color w:val="52575E"/>
+                <w:sz w:val="20"/>
+                <w:szCs w:val="20"/>
+              </w:rPr>
+              <w:t>for SIP based voice communication</w:t>
+            </w:r>
+          </w:p>
+          <w:p>
+            <w:pPr>
+              <w:pStyle w:val="ListParagraph"/>
+              <w:numPr>
+                <w:ilvl w:val="0"/>
+                <w:numId w:val="1"/>
+              </w:numPr>
+              <w:snapToGrid w:val="0"/>
+              <w:spacing w:after="80" w:line="278" w:lineRule="auto"/>
+              <w:ind w:left="397" w:hanging="227"/>
+              <w:rPr>
+                <w:rFonts w:ascii="Inter 18pt 18pt" w:hAnsi="Inter 18pt 18pt"/>
+                <w:color w:val="52575E"/>
+                <w:sz w:val="20"/>
+                <w:szCs w:val="20"/>
+                <w:lang w:val="en-PK"/>
+              </w:rPr>
+            </w:pPr>
+            <w:r>
+              <w:rPr>
+                <w:rFonts w:ascii="Inter 18pt 18pt" w:hAnsi="Inter 18pt 18pt"/>
+                <w:color w:val="52575E"/>
+                <w:sz w:val="20"/>
+                <w:szCs w:val="20"/>
+                <w:lang w:val="en-GB"/>
+              </w:rPr>
+              <w:t>Administered</w:t>
+            </w:r>
+            <w:r>
+              <w:rPr>
+                <w:rFonts w:ascii="Inter 18pt 18pt" w:hAnsi="Inter 18pt 18pt"/>
+                <w:color w:val="52575E"/>
+                <w:sz w:val="20"/>
+                <w:szCs w:val="20"/>
+                <w:lang w:val="en-PK"/>
+              </w:rPr>
+              <w:t xml:space="preserve"> LTE EPC and eUTRAN</w:t>
+            </w:r>
+          </w:p>
+          <w:p>
+            <w:pPr>
+              <w:pStyle w:val="ListParagraph"/>
+              <w:numPr>
+                <w:ilvl w:val="0"/>
+                <w:numId w:val="1"/>
+              </w:numPr>
+              <w:snapToGrid w:val="0"/>
+              <w:spacing w:after="80"/>
+              <w:ind w:left="397" w:hanging="227"/>
+              <w:rPr>
+                <w:rFonts w:ascii="Inter 18pt 18pt" w:hAnsi="Inter 18pt 18pt"/>
+                <w:color w:val="52575E"/>
+                <w:sz w:val="20"/>
+                <w:szCs w:val="20"/>
+                <w:lang w:val="en-PK"/>
+              </w:rPr>
+            </w:pPr>
+            <w:r>
+              <w:rPr>
+                <w:rFonts w:ascii="Inter 18pt 18pt" w:hAnsi="Inter 18pt 18pt"/>
+                <w:color w:val="52575E"/>
+                <w:sz w:val="20"/>
+                <w:szCs w:val="20"/>
+                <w:lang w:val="en-GB"/>
+              </w:rPr>
+              <w:t>Operated and Administered OFC infrastructure</w:t>
+            </w:r>
+          </w:p>
+          <w:p>
+            <w:pPr>
+              <w:rPr>
+                <w:rFonts w:ascii="Playfair Display" w:hAnsi="Playfair Display" w:cs="Times New Roman (Body CS)"/>
                 <w:b/>
                 <w:bCs/>
-                <w:color w:val="24272E"/>
-              </w:rPr>
-              <w:t>. AVIONICS</w:t>
-            </w:r>
-          </w:p>
-          <w:p>
-            <w:pPr>
-              <w:spacing w:line="360" w:lineRule="auto"/>
-              <w:rPr>
-                <w:rFonts w:ascii="Inter 18pt 18pt" w:hAnsi="Inter 18pt 18pt"/>
-                <w:color w:val="656B72"/>
-                <w:sz w:val="20"/>
-                <w:szCs w:val="20"/>
-              </w:rPr>
-            </w:pPr>
-            <w:r>
-              <w:rPr>
-                <w:rFonts w:ascii="Inter 18pt 18pt" w:hAnsi="Inter 18pt 18pt"/>
-                <w:color w:val="3B3E45"/>
-                <w:sz w:val="20"/>
-                <w:szCs w:val="20"/>
-              </w:rPr>
-              <w:t xml:space="preserve">CAE, </w:t>
-            </w:r>
-            <w:r>
-              <w:rPr>
-                <w:rFonts w:ascii="Inter 18pt 18pt" w:hAnsi="Inter 18pt 18pt"/>
-                <w:color w:val="3B3E45"/>
-                <w:sz w:val="20"/>
-                <w:szCs w:val="20"/>
-              </w:rPr>
-              <w:t xml:space="preserve">National University of Sciences and Technology </w:t>
-            </w:r>
-            <w:r>
-              <w:rPr>
-                <w:rFonts w:ascii="Inter 18pt 18pt" w:hAnsi="Inter 18pt 18pt"/>
-                <w:color w:val="3B3E45"/>
-                <w:sz w:val="20"/>
-                <w:szCs w:val="20"/>
-              </w:rPr>
-              <w:t>(</w:t>
-            </w:r>
-            <w:r>
-              <w:rPr>
-                <w:rFonts w:ascii="Inter 18pt 18pt" w:hAnsi="Inter 18pt 18pt"/>
-                <w:color w:val="3B3E45"/>
-                <w:sz w:val="20"/>
-                <w:szCs w:val="20"/>
-              </w:rPr>
-              <w:t>NUST</w:t>
-            </w:r>
-            <w:r>
-              <w:rPr>
-                <w:rFonts w:ascii="Inter 18pt 18pt" w:hAnsi="Inter 18pt 18pt"/>
-                <w:color w:val="3B3E45"/>
-                <w:sz w:val="20"/>
-                <w:szCs w:val="20"/>
-              </w:rPr>
-              <w:t>)</w:t>
-            </w:r>
-            <w:r>
-              <w:rPr>
-                <w:rFonts w:ascii="Inter 18pt 18pt" w:hAnsi="Inter 18pt 18pt"/>
-                <w:color w:val="3B3E45"/>
-                <w:sz w:val="20"/>
-                <w:szCs w:val="20"/>
-              </w:rPr>
-              <w:t>, IBD</w:t>
-            </w:r>
-            <w:r>
-              <w:rPr>
-                <w:rFonts w:ascii="Inter 18pt 18pt" w:hAnsi="Inter 18pt 18pt"/>
-                <w:color w:val="3B3E45"/>
-                <w:sz w:val="20"/>
-                <w:szCs w:val="20"/>
-              </w:rPr>
-              <w:t xml:space="preserve"> </w:t>
-            </w:r>
-            <w:r>
-              <w:rPr>
-                <w:rFonts w:ascii="Inter 18pt 18pt" w:hAnsi="Inter 18pt 18pt"/>
-                <w:color w:val="656B72"/>
-                <w:sz w:val="20"/>
-                <w:szCs w:val="20"/>
-              </w:rPr>
-              <w:t xml:space="preserve">| </w:t>
-            </w:r>
-            <w:r>
-              <w:rPr>
-                <w:rFonts w:ascii="Inter 18pt 18pt" w:hAnsi="Inter 18pt 18pt"/>
-                <w:color w:val="656B72"/>
-                <w:sz w:val="20"/>
-                <w:szCs w:val="20"/>
-              </w:rPr>
-              <w:t>November 2018 - October 2022</w:t>
-            </w:r>
-          </w:p>
-          <w:p>
-            <w:pPr>
-              <w:rPr>
-                <w:rFonts w:ascii="Inter 18pt 18pt" w:hAnsi="Inter 18pt 18pt"/>
-                <w:color w:val="24272E"/>
-                <w:sz w:val="20"/>
-                <w:szCs w:val="20"/>
-              </w:rPr>
-            </w:pPr>
-            <w:r>
-              <w:rPr>
-                <w:rFonts w:ascii="Inter 18pt 18pt" w:hAnsi="Inter 18pt 18pt"/>
-                <w:color w:val="24272E"/>
-                <w:sz w:val="20"/>
-                <w:szCs w:val="20"/>
-              </w:rPr>
-              <w:t>Bachelor of Engineering - Avionics</w:t>
-            </w:r>
-            <w:r>
-              <w:rPr>
-                <w:rFonts w:ascii="Inter 18pt 18pt" w:hAnsi="Inter 18pt 18pt"/>
-                <w:color w:val="24272E"/>
-                <w:sz w:val="20"/>
-                <w:szCs w:val="20"/>
-              </w:rPr>
-              <w:t xml:space="preserve"> Engineering</w:t>
-            </w:r>
-            <w:r>
-              <w:rPr>
-                <w:rFonts w:ascii="Inter 18pt 18pt" w:hAnsi="Inter 18pt 18pt"/>
-                <w:color w:val="24272E"/>
-                <w:sz w:val="20"/>
-                <w:szCs w:val="20"/>
-              </w:rPr>
-              <w:t xml:space="preserve"> – </w:t>
-            </w:r>
-            <w:r>
-              <w:rPr>
-                <w:rFonts w:ascii="Inter 18pt 18pt" w:hAnsi="Inter 18pt 18pt"/>
-                <w:color w:val="24272E"/>
-                <w:sz w:val="20"/>
-                <w:szCs w:val="20"/>
-              </w:rPr>
-              <w:t>Majors:</w:t>
-            </w:r>
-            <w:r>
-              <w:rPr>
-                <w:rFonts w:ascii="Inter 18pt 18pt" w:hAnsi="Inter 18pt 18pt"/>
-                <w:color w:val="24272E"/>
-                <w:sz w:val="20"/>
-                <w:szCs w:val="20"/>
-              </w:rPr>
-              <w:t xml:space="preserve"> Engineering Circuit Analysis, Data Communication &amp; Networks, Analogue and Digital Communications</w:t>
-            </w:r>
-            <w:r>
-              <w:rPr>
-                <w:rFonts w:ascii="Inter 18pt 18pt" w:hAnsi="Inter 18pt 18pt"/>
-                <w:color w:val="24272E"/>
-                <w:sz w:val="20"/>
-                <w:szCs w:val="20"/>
-              </w:rPr>
-              <w:t>, Avionics System Design, Microwave and Antenna Theory</w:t>
-            </w:r>
-            <w:r>
-              <w:rPr>
-                <w:rFonts w:ascii="Inter 18pt 18pt" w:hAnsi="Inter 18pt 18pt"/>
-                <w:color w:val="24272E"/>
-                <w:sz w:val="20"/>
-                <w:szCs w:val="20"/>
-              </w:rPr>
-              <w:t xml:space="preserve"> </w:t>
-            </w:r>
-          </w:p>
-          <w:p>
-            <w:pPr>
-              <w:rPr>
-                <w:rFonts w:ascii="Inter 18pt 18pt" w:hAnsi="Inter 18pt 18pt"/>
-                <w:sz w:val="32"/>
-                <w:szCs w:val="32"/>
+                <w:color w:val="1588CF"/>
+                <w:sz w:val="28"/>
+                <w:szCs w:val="28"/>
               </w:rPr>
             </w:pPr>
           </w:p>
@@ -881,7 +1186,7 @@
               <mc:AlternateContent>
                 <mc:Choice Requires="wps">
                   <w:drawing>
-                    <wp:anchor distT="0" distB="0" distL="114300" distR="114300" simplePos="0" relativeHeight="251661312" behindDoc="0" locked="0" layoutInCell="1" allowOverlap="1" wp14:anchorId="1CF543E6" wp14:editId="4133922E">
+                    <wp:anchor distT="0" distB="0" distL="114300" distR="114300" simplePos="0" relativeHeight="251661312" behindDoc="0" locked="0" layoutInCell="1" allowOverlap="1" wp14:anchorId="1CF543E6" wp14:editId="10A3AB87">
                       <wp:simplePos x="0" y="0"/>
                       <wp:positionH relativeFrom="column">
                         <wp:posOffset>-130336</wp:posOffset>
@@ -892,7 +1197,13 @@
                       <wp:extent cx="7092000" cy="0"/>
                       <wp:effectExtent l="0" t="19050" r="33020" b="19050"/>
                       <wp:wrapNone/>
-                      <wp:docPr id="1900433605" name="Straight Connector 32"/>
+                      <wp:docPr id="1900433605" name="Straight Connector 32">
+                        <a:extLst xmlns:a="http://schemas.openxmlformats.org/drawingml/2006/main">
+                          <a:ext uri="{C183D7F6-B498-43B3-948B-1728B52AA6E4}">
+                            <adec:decorative xmlns:adec="http://schemas.microsoft.com/office/drawing/2017/decorative" val="1"/>
+                          </a:ext>
+                        </a:extLst>
+                      </wp:docPr>
                       <wp:cNvGraphicFramePr/>
                       <a:graphic xmlns:a="http://schemas.openxmlformats.org/drawingml/2006/main">
                         <a:graphicData uri="http://schemas.microsoft.com/office/word/2010/wordprocessingShape">
@@ -938,7 +1249,7 @@
                 </mc:Choice>
                 <mc:Fallback>
                   <w:pict>
-                    <v:line w14:anchorId="3BE9F03D" id="Straight Connector 32" o:spid="_x0000_s1026" style="position:absolute;z-index:251661312;visibility:visible;mso-wrap-style:square;mso-width-percent:0;mso-wrap-distance-left:9pt;mso-wrap-distance-top:0;mso-wrap-distance-right:9pt;mso-wrap-distance-bottom:0;mso-position-horizontal:absolute;mso-position-horizontal-relative:text;mso-position-vertical:absolute;mso-position-vertical-relative:text;mso-width-percent:0;mso-width-relative:margin" from="-10.25pt,5.9pt" to="548.2pt,5.9pt" o:gfxdata="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" strokecolor="#cbcfd4" strokeweight="3pt">
+                    <v:line w14:anchorId="79A0D0BF" id="Straight Connector 32" o:spid="_x0000_s1026" alt="&quot;&quot;" style="position:absolute;z-index:251661312;visibility:visible;mso-wrap-style:square;mso-width-percent:0;mso-wrap-distance-left:9pt;mso-wrap-distance-top:0;mso-wrap-distance-right:9pt;mso-wrap-distance-bottom:0;mso-position-horizontal:absolute;mso-position-horizontal-relative:text;mso-position-vertical:absolute;mso-position-vertical-relative:text;mso-width-percent:0;mso-width-relative:margin" from="-10.25pt,5.9pt" to="548.2pt,5.9pt" o:gfxdata="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" strokecolor="#cbcfd4" strokeweight="3pt">
                       <v:stroke joinstyle="miter"/>
                     </v:line>
                   </w:pict>
@@ -1038,7 +1349,7 @@
                 <w:sz w:val="20"/>
                 <w:szCs w:val="20"/>
               </w:rPr>
-              <w:t>2/5/2025</w:t>
+              <w:t>7</w:t>
             </w:r>
             <w:r>
               <w:rPr>
@@ -1047,6 +1358,33 @@
                 <w:sz w:val="20"/>
                 <w:szCs w:val="20"/>
               </w:rPr>
+              <w:t>/</w:t>
+            </w:r>
+            <w:r>
+              <w:rPr>
+                <w:rFonts w:ascii="Inter 18pt 18pt" w:hAnsi="Inter 18pt 18pt"/>
+                <w:color w:val="656B72"/>
+                <w:sz w:val="20"/>
+                <w:szCs w:val="20"/>
+              </w:rPr>
+              <w:t>11</w:t>
+            </w:r>
+            <w:r>
+              <w:rPr>
+                <w:rFonts w:ascii="Inter 18pt 18pt" w:hAnsi="Inter 18pt 18pt"/>
+                <w:color w:val="656B72"/>
+                <w:sz w:val="20"/>
+                <w:szCs w:val="20"/>
+              </w:rPr>
+              <w:t>/2025</w:t>
+            </w:r>
+            <w:r>
+              <w:rPr>
+                <w:rFonts w:ascii="Inter 18pt 18pt" w:hAnsi="Inter 18pt 18pt"/>
+                <w:color w:val="656B72"/>
+                <w:sz w:val="20"/>
+                <w:szCs w:val="20"/>
+              </w:rPr>
               <w:t xml:space="preserve"> – </w:t>
             </w:r>
             <w:r>
@@ -1056,7 +1394,7 @@
                 <w:sz w:val="20"/>
                 <w:szCs w:val="20"/>
               </w:rPr>
-              <w:t>English</w:t>
+              <w:t xml:space="preserve"> Certificate Number</w:t>
             </w:r>
             <w:r>
               <w:rPr>
@@ -1065,6 +1403,15 @@
                 <w:sz w:val="20"/>
                 <w:szCs w:val="20"/>
               </w:rPr>
+              <w:t xml:space="preserve"> </w:t>
+            </w:r>
+            <w:r>
+              <w:rPr>
+                <w:rFonts w:ascii="Inter 18pt 18pt" w:hAnsi="Inter 18pt 18pt"/>
+                <w:color w:val="656B72"/>
+                <w:sz w:val="20"/>
+                <w:szCs w:val="20"/>
+              </w:rPr>
               <w:t xml:space="preserve"> – </w:t>
             </w:r>
             <w:r>
@@ -1074,25 +1421,7 @@
                 <w:sz w:val="20"/>
                 <w:szCs w:val="20"/>
               </w:rPr>
-              <w:t>Global</w:t>
-            </w:r>
-            <w:r>
-              <w:rPr>
-                <w:rFonts w:ascii="Inter 18pt 18pt" w:hAnsi="Inter 18pt 18pt"/>
-                <w:color w:val="656B72"/>
-                <w:sz w:val="20"/>
-                <w:szCs w:val="20"/>
-              </w:rPr>
-              <w:t xml:space="preserve"> </w:t>
-            </w:r>
-            <w:r>
-              <w:rPr>
-                <w:rFonts w:ascii="Inter 18pt 18pt" w:hAnsi="Inter 18pt 18pt"/>
-                <w:color w:val="656B72"/>
-                <w:sz w:val="20"/>
-                <w:szCs w:val="20"/>
-              </w:rPr>
-              <w:t>Web Delivery Test Center</w:t>
+              <w:t>252937250</w:t>
             </w:r>
           </w:p>
           <w:p>
@@ -1161,7 +1490,7 @@
               <mc:AlternateContent>
                 <mc:Choice Requires="wps">
                   <w:drawing>
-                    <wp:anchor distT="0" distB="0" distL="114300" distR="114300" simplePos="0" relativeHeight="251665408" behindDoc="0" locked="0" layoutInCell="1" allowOverlap="1" wp14:anchorId="36043402" wp14:editId="22BA46CA">
+                    <wp:anchor distT="0" distB="0" distL="114300" distR="114300" simplePos="0" relativeHeight="251665408" behindDoc="0" locked="0" layoutInCell="1" allowOverlap="1" wp14:anchorId="36043402" wp14:editId="71F81CCD">
                       <wp:simplePos x="0" y="0"/>
                       <wp:positionH relativeFrom="column">
                         <wp:posOffset>-129379</wp:posOffset>
@@ -1172,7 +1501,13 @@
                       <wp:extent cx="7092000" cy="0"/>
                       <wp:effectExtent l="0" t="19050" r="33020" b="19050"/>
                       <wp:wrapNone/>
-                      <wp:docPr id="1019689834" name="Straight Connector 32"/>
+                      <wp:docPr id="1019689834" name="Straight Connector 32">
+                        <a:extLst xmlns:a="http://schemas.openxmlformats.org/drawingml/2006/main">
+                          <a:ext uri="{C183D7F6-B498-43B3-948B-1728B52AA6E4}">
+                            <adec:decorative xmlns:adec="http://schemas.microsoft.com/office/drawing/2017/decorative" val="1"/>
+                          </a:ext>
+                        </a:extLst>
+                      </wp:docPr>
                       <wp:cNvGraphicFramePr/>
                       <a:graphic xmlns:a="http://schemas.openxmlformats.org/drawingml/2006/main">
                         <a:graphicData uri="http://schemas.microsoft.com/office/word/2010/wordprocessingShape">
@@ -1218,7 +1553,7 @@
                 </mc:Choice>
                 <mc:Fallback>
                   <w:pict>
-                    <v:line w14:anchorId="7E02904A" id="Straight Connector 32" o:spid="_x0000_s1026" style="position:absolute;z-index:251665408;visibility:visible;mso-wrap-style:square;mso-width-percent:0;mso-wrap-distance-left:9pt;mso-wrap-distance-top:0;mso-wrap-distance-right:9pt;mso-wrap-distance-bottom:0;mso-position-horizontal:absolute;mso-position-horizontal-relative:text;mso-position-vertical:absolute;mso-position-vertical-relative:text;mso-width-percent:0;mso-width-relative:margin" from="-10.2pt,5.5pt" to="548.25pt,5.5pt" o:gfxdata="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" strokecolor="#cbcfd4" strokeweight="3pt">
+                    <v:line w14:anchorId="38409827" id="Straight Connector 32" o:spid="_x0000_s1026" alt="&quot;&quot;" style="position:absolute;z-index:251665408;visibility:visible;mso-wrap-style:square;mso-width-percent:0;mso-wrap-distance-left:9pt;mso-wrap-distance-top:0;mso-wrap-distance-right:9pt;mso-wrap-distance-bottom:0;mso-position-horizontal:absolute;mso-position-horizontal-relative:text;mso-position-vertical:absolute;mso-position-vertical-relative:text;mso-width-percent:0;mso-width-relative:margin" from="-10.2pt,5.5pt" to="548.25pt,5.5pt" o:gfxdata="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" strokecolor="#cbcfd4" strokeweight="3pt">
                       <v:stroke joinstyle="miter"/>
                     </v:line>
                   </w:pict>
@@ -1377,22 +1712,12 @@
                 <w:sz w:val="28"/>
                 <w:szCs w:val="28"/>
               </w:rPr>
-              <w:t xml:space="preserve">Professional </w:t>
-            </w:r>
-            <w:r>
-              <w:rPr>
-                <w:rFonts w:ascii="Playfair Display" w:hAnsi="Playfair Display" w:cs="Times New Roman (Body CS)"/>
-                <w:b/>
-                <w:bCs/>
-                <w:color w:val="1588CF"/>
-                <w:sz w:val="28"/>
-                <w:szCs w:val="28"/>
-              </w:rPr>
-              <w:t>Experience</w:t>
-            </w:r>
-          </w:p>
-          <w:p>
-            <w:pPr>
+              <w:t>Professional Courses</w:t>
+            </w:r>
+          </w:p>
+          <w:p>
+            <w:pPr>
+              <w:snapToGrid w:val="0"/>
               <w:rPr>
                 <w:rFonts w:ascii="Inter 18pt 18pt" w:hAnsi="Inter 18pt 18pt"/>
                 <w:sz w:val="32"/>
@@ -1412,10 +1737,10 @@
               <mc:AlternateContent>
                 <mc:Choice Requires="wps">
                   <w:drawing>
-                    <wp:anchor distT="0" distB="0" distL="114300" distR="114300" simplePos="0" relativeHeight="251667456" behindDoc="0" locked="0" layoutInCell="1" allowOverlap="1" wp14:anchorId="2F1672B1" wp14:editId="697E1EB7">
+                    <wp:anchor distT="0" distB="0" distL="114300" distR="114300" simplePos="0" relativeHeight="251669504" behindDoc="0" locked="0" layoutInCell="1" allowOverlap="1" wp14:anchorId="64A9AF74" wp14:editId="5675DE9B">
                       <wp:simplePos x="0" y="0"/>
                       <wp:positionH relativeFrom="column">
-                        <wp:posOffset>-132554</wp:posOffset>
+                        <wp:posOffset>-131919</wp:posOffset>
                       </wp:positionH>
                       <wp:positionV relativeFrom="paragraph">
                         <wp:posOffset>85090</wp:posOffset>
@@ -1423,7 +1748,13 @@
                       <wp:extent cx="7092000" cy="0"/>
                       <wp:effectExtent l="0" t="19050" r="33020" b="19050"/>
                       <wp:wrapNone/>
-                      <wp:docPr id="2018724291" name="Straight Connector 32"/>
+                      <wp:docPr id="1542576244" name="Straight Connector 32">
+                        <a:extLst xmlns:a="http://schemas.openxmlformats.org/drawingml/2006/main">
+                          <a:ext uri="{C183D7F6-B498-43B3-948B-1728B52AA6E4}">
+                            <adec:decorative xmlns:adec="http://schemas.microsoft.com/office/drawing/2017/decorative" val="1"/>
+                          </a:ext>
+                        </a:extLst>
+                      </wp:docPr>
                       <wp:cNvGraphicFramePr/>
                       <a:graphic xmlns:a="http://schemas.openxmlformats.org/drawingml/2006/main">
                         <a:graphicData uri="http://schemas.microsoft.com/office/word/2010/wordprocessingShape">
@@ -1469,7 +1800,7 @@
                 </mc:Choice>
                 <mc:Fallback>
                   <w:pict>
-                    <v:line w14:anchorId="12A165B9" id="Straight Connector 32" o:spid="_x0000_s1026" style="position:absolute;z-index:251667456;visibility:visible;mso-wrap-style:square;mso-width-percent:0;mso-wrap-distance-left:9pt;mso-wrap-distance-top:0;mso-wrap-distance-right:9pt;mso-wrap-distance-bottom:0;mso-position-horizontal:absolute;mso-position-horizontal-relative:text;mso-position-vertical:absolute;mso-position-vertical-relative:text;mso-width-percent:0;mso-width-relative:margin" from="-10.45pt,6.7pt" to="548pt,6.7pt" o:gfxdata="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" strokecolor="#cbcfd4" strokeweight="3pt">
+                    <v:line w14:anchorId="690445CE" id="Straight Connector 32" o:spid="_x0000_s1026" alt="&quot;&quot;" style="position:absolute;z-index:251669504;visibility:visible;mso-wrap-style:square;mso-width-percent:0;mso-wrap-distance-left:9pt;mso-wrap-distance-top:0;mso-wrap-distance-right:9pt;mso-wrap-distance-bottom:0;mso-position-horizontal:absolute;mso-position-horizontal-relative:text;mso-position-vertical:absolute;mso-position-vertical-relative:text;mso-width-percent:0;mso-width-relative:margin" from="-10.4pt,6.7pt" to="548.05pt,6.7pt" o:gfxdata="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" strokecolor="#cbcfd4" strokeweight="3pt">
                       <v:stroke joinstyle="miter"/>
                     </v:line>
                   </w:pict>
@@ -1487,27 +1818,267 @@
                 <w:color w:val="24272E"/>
               </w:rPr>
             </w:pPr>
-            <w:r>
+            <w:hyperlink r:id="rId8" w:history="1">
+              <w:r>
+                <w:rPr>
+                  <w:rStyle w:val="Hyperlink"/>
+                  <w:rFonts w:ascii="Inter 18pt 18pt SemiBold" w:hAnsi="Inter 18pt 18pt SemiBold"/>
+                  <w:b/>
+                  <w:bCs/>
+                </w:rPr>
+                <w:t>4G NETWORK FUNDAMENTALS</w:t>
+              </w:r>
+            </w:hyperlink>
+          </w:p>
+          <w:p>
+            <w:pPr>
+              <w:snapToGrid w:val="0"/>
+              <w:spacing w:line="300" w:lineRule="auto"/>
+              <w:rPr>
+                <w:rFonts w:ascii="Inter 18pt 18pt" w:hAnsi="Inter 18pt 18pt"/>
+                <w:color w:val="52575E"/>
+                <w:sz w:val="20"/>
+                <w:szCs w:val="20"/>
+              </w:rPr>
+            </w:pPr>
+            <w:r>
+              <w:rPr>
+                <w:rFonts w:ascii="Inter 18pt 18pt" w:hAnsi="Inter 18pt 18pt"/>
+                <w:color w:val="656B72"/>
+                <w:sz w:val="20"/>
+                <w:szCs w:val="20"/>
+              </w:rPr>
+              <w:t>Mar 20</w:t>
+            </w:r>
+            <w:r>
+              <w:rPr>
+                <w:rFonts w:ascii="Inter 18pt 18pt" w:hAnsi="Inter 18pt 18pt"/>
+                <w:color w:val="656B72"/>
+                <w:sz w:val="20"/>
+                <w:szCs w:val="20"/>
+              </w:rPr>
+              <w:t>25</w:t>
+            </w:r>
+            <w:r>
+              <w:rPr>
+                <w:rFonts w:ascii="Inter 18pt 18pt" w:hAnsi="Inter 18pt 18pt"/>
+                <w:color w:val="656B72"/>
+                <w:sz w:val="20"/>
+                <w:szCs w:val="20"/>
+              </w:rPr>
+              <w:br/>
+            </w:r>
+            <w:r>
+              <w:rPr>
+                <w:rFonts w:ascii="Inter 18pt 18pt" w:hAnsi="Inter 18pt 18pt"/>
+                <w:color w:val="24272E"/>
+                <w:sz w:val="20"/>
+                <w:szCs w:val="20"/>
+              </w:rPr>
+              <w:t>Institut Mines-Télécom (IMT)</w:t>
+            </w:r>
+            <w:r>
+              <w:rPr>
+                <w:rFonts w:ascii="Inter 18pt 18pt" w:hAnsi="Inter 18pt 18pt"/>
+                <w:color w:val="24272E"/>
+                <w:sz w:val="20"/>
+                <w:szCs w:val="20"/>
+              </w:rPr>
+              <w:t xml:space="preserve"> </w:t>
+            </w:r>
+            <w:r>
+              <w:rPr>
+                <w:rFonts w:ascii="Inter 18pt 18pt" w:hAnsi="Inter 18pt 18pt"/>
+                <w:color w:val="24272E"/>
+                <w:sz w:val="20"/>
+                <w:szCs w:val="20"/>
+              </w:rPr>
+              <w:t>–</w:t>
+            </w:r>
+            <w:r>
+              <w:rPr>
+                <w:rFonts w:ascii="Inter 18pt 18pt" w:hAnsi="Inter 18pt 18pt"/>
+                <w:color w:val="24272E"/>
+                <w:sz w:val="20"/>
+                <w:szCs w:val="20"/>
+              </w:rPr>
+              <w:t xml:space="preserve"> </w:t>
+            </w:r>
+            <w:r>
+              <w:rPr>
+                <w:rFonts w:ascii="Inter 18pt 18pt" w:hAnsi="Inter 18pt 18pt"/>
+                <w:color w:val="24272E"/>
+                <w:sz w:val="20"/>
+                <w:szCs w:val="20"/>
+              </w:rPr>
+              <w:t>Credential</w:t>
+            </w:r>
+            <w:r>
+              <w:rPr>
+                <w:rFonts w:ascii="Inter 18pt 18pt" w:hAnsi="Inter 18pt 18pt"/>
+                <w:color w:val="24272E"/>
+                <w:sz w:val="20"/>
+                <w:szCs w:val="20"/>
+              </w:rPr>
+              <w:t xml:space="preserve"> </w:t>
+            </w:r>
+            <w:r>
+              <w:rPr>
+                <w:rFonts w:ascii="Inter 18pt 18pt" w:hAnsi="Inter 18pt 18pt"/>
+                <w:color w:val="24272E"/>
+                <w:sz w:val="20"/>
+                <w:szCs w:val="20"/>
+              </w:rPr>
+              <w:t>ID RVSJFBEWR6IA</w:t>
+            </w:r>
+          </w:p>
+          <w:p>
+            <w:pPr>
+              <w:snapToGrid w:val="0"/>
+              <w:spacing w:after="80"/>
+              <w:rPr>
+                <w:rFonts w:ascii="Inter 18pt 18pt" w:hAnsi="Inter 18pt 18pt"/>
+                <w:sz w:val="20"/>
+                <w:szCs w:val="20"/>
+              </w:rPr>
+            </w:pPr>
+          </w:p>
+          <w:p>
+            <w:pPr>
+              <w:spacing w:line="300" w:lineRule="auto"/>
               <w:rPr>
                 <w:rFonts w:ascii="Inter 18pt 18pt SemiBold" w:hAnsi="Inter 18pt 18pt SemiBold"/>
                 <w:b/>
                 <w:bCs/>
                 <w:color w:val="24272E"/>
               </w:rPr>
-              <w:t>NETWORKING AND TELECOMMUNICATIONS ENGINEER</w:t>
-            </w:r>
-            <w:r>
+            </w:pPr>
+            <w:hyperlink r:id="rId9" w:history="1">
+              <w:r>
+                <w:rPr>
+                  <w:rStyle w:val="Hyperlink"/>
+                  <w:rFonts w:ascii="Inter 18pt 18pt SemiBold" w:hAnsi="Inter 18pt 18pt SemiBold"/>
+                  <w:b/>
+                  <w:bCs/>
+                </w:rPr>
+                <w:t>FOUNDATIONS OF CYBERSECURITY</w:t>
+              </w:r>
+            </w:hyperlink>
+          </w:p>
+          <w:p>
+            <w:pPr>
+              <w:snapToGrid w:val="0"/>
+              <w:spacing w:line="300" w:lineRule="auto"/>
+              <w:rPr>
+                <w:rFonts w:ascii="Inter 18pt 18pt" w:hAnsi="Inter 18pt 18pt"/>
+                <w:color w:val="656B72"/>
+                <w:sz w:val="20"/>
+                <w:szCs w:val="20"/>
+              </w:rPr>
+            </w:pPr>
+            <w:r>
+              <w:rPr>
+                <w:rFonts w:ascii="Inter 18pt 18pt" w:hAnsi="Inter 18pt 18pt"/>
+                <w:color w:val="656B72"/>
+                <w:sz w:val="20"/>
+                <w:szCs w:val="20"/>
+              </w:rPr>
+              <w:t>Oct 2023</w:t>
+            </w:r>
+          </w:p>
+          <w:p>
+            <w:pPr>
+              <w:snapToGrid w:val="0"/>
+              <w:rPr>
+                <w:rFonts w:ascii="Inter 18pt 18pt" w:hAnsi="Inter 18pt 18pt"/>
+                <w:color w:val="52575E"/>
+                <w:sz w:val="20"/>
+                <w:szCs w:val="20"/>
+              </w:rPr>
+            </w:pPr>
+            <w:r>
+              <w:rPr>
+                <w:rFonts w:ascii="Inter 18pt 18pt" w:hAnsi="Inter 18pt 18pt"/>
+                <w:color w:val="52575E"/>
+                <w:sz w:val="20"/>
+                <w:szCs w:val="20"/>
+              </w:rPr>
+              <w:t>Google</w:t>
+            </w:r>
+            <w:r>
+              <w:rPr>
+                <w:rFonts w:ascii="Inter 18pt 18pt" w:hAnsi="Inter 18pt 18pt"/>
+                <w:color w:val="52575E"/>
+                <w:sz w:val="20"/>
+                <w:szCs w:val="20"/>
+              </w:rPr>
+              <w:t xml:space="preserve"> – </w:t>
+            </w:r>
+            <w:r>
+              <w:rPr>
+                <w:rFonts w:ascii="Inter 18pt 18pt" w:hAnsi="Inter 18pt 18pt"/>
+                <w:color w:val="52575E"/>
+                <w:sz w:val="20"/>
+                <w:szCs w:val="20"/>
+              </w:rPr>
+              <w:t>Credential</w:t>
+            </w:r>
+            <w:r>
+              <w:rPr>
+                <w:rFonts w:ascii="Inter 18pt 18pt" w:hAnsi="Inter 18pt 18pt"/>
+                <w:color w:val="52575E"/>
+                <w:sz w:val="20"/>
+                <w:szCs w:val="20"/>
+              </w:rPr>
+              <w:t xml:space="preserve"> </w:t>
+            </w:r>
+            <w:r>
+              <w:rPr>
+                <w:rFonts w:ascii="Inter 18pt 18pt" w:hAnsi="Inter 18pt 18pt"/>
+                <w:color w:val="52575E"/>
+                <w:sz w:val="20"/>
+                <w:szCs w:val="20"/>
+              </w:rPr>
+              <w:t>ID LAN7856EY6R4</w:t>
+            </w:r>
+          </w:p>
+          <w:p>
+            <w:pPr>
+              <w:spacing w:line="300" w:lineRule="auto"/>
+              <w:rPr>
+                <w:rStyle w:val="Hyperlink"/>
+                <w:rFonts w:ascii="Inter 18pt 18pt SemiBold" w:hAnsi="Inter 18pt 18pt SemiBold"/>
+                <w:b/>
+                <w:bCs/>
+              </w:rPr>
+            </w:pPr>
+          </w:p>
+          <w:p>
+            <w:pPr>
+              <w:spacing w:line="300" w:lineRule="auto"/>
               <w:rPr>
                 <w:rFonts w:ascii="Inter 18pt 18pt SemiBold" w:hAnsi="Inter 18pt 18pt SemiBold"/>
                 <w:b/>
                 <w:bCs/>
                 <w:color w:val="24272E"/>
               </w:rPr>
-              <w:t xml:space="preserve"> </w:t>
-            </w:r>
-          </w:p>
-          <w:p>
-            <w:pPr>
+            </w:pPr>
+            <w:hyperlink r:id="rId10" w:history="1">
+              <w:r>
+                <w:rPr>
+                  <w:rStyle w:val="Hyperlink"/>
+                  <w:rFonts w:ascii="Inter 18pt 18pt SemiBold" w:hAnsi="Inter 18pt 18pt SemiBold"/>
+                  <w:b/>
+                  <w:bCs/>
+                </w:rPr>
+                <w:t>THE BITS AND BYTES OF COMPUTER NETWORKING</w:t>
+              </w:r>
+            </w:hyperlink>
+          </w:p>
+          <w:p>
+            <w:pPr>
+              <w:snapToGrid w:val="0"/>
+              <w:spacing w:line="300" w:lineRule="auto"/>
               <w:rPr>
                 <w:rFonts w:ascii="Inter 18pt 18pt" w:hAnsi="Inter 18pt 18pt"/>
                 <w:color w:val="656B72"/>
@@ -1518,402 +2089,142 @@
             <w:r>
               <w:rPr>
                 <w:rFonts w:ascii="Inter 18pt 18pt" w:hAnsi="Inter 18pt 18pt"/>
-                <w:sz w:val="20"/>
-                <w:szCs w:val="20"/>
-              </w:rPr>
-              <w:t>Pakistan Air Force</w:t>
-            </w:r>
-            <w:r>
-              <w:rPr>
-                <w:rFonts w:ascii="Inter 18pt 18pt" w:hAnsi="Inter 18pt 18pt"/>
-                <w:sz w:val="20"/>
-                <w:szCs w:val="20"/>
-              </w:rPr>
-              <w:t xml:space="preserve"> | </w:t>
-            </w:r>
-            <w:r>
-              <w:rPr>
-                <w:rFonts w:ascii="Inter 18pt 18pt" w:hAnsi="Inter 18pt 18pt"/>
                 <w:color w:val="656B72"/>
                 <w:sz w:val="20"/>
                 <w:szCs w:val="20"/>
               </w:rPr>
-              <w:t xml:space="preserve">July 2023 </w:t>
-            </w:r>
-            <w:r>
+              <w:t>Oct 2023</w:t>
+            </w:r>
+          </w:p>
+          <w:p>
+            <w:pPr>
+              <w:snapToGrid w:val="0"/>
+              <w:rPr>
+                <w:rFonts w:ascii="Inter 18pt 18pt" w:hAnsi="Inter 18pt 18pt"/>
+                <w:color w:val="52575E"/>
+                <w:sz w:val="20"/>
+                <w:szCs w:val="20"/>
+              </w:rPr>
+            </w:pPr>
+            <w:r>
+              <w:rPr>
+                <w:rFonts w:ascii="Inter 18pt 18pt" w:hAnsi="Inter 18pt 18pt"/>
+                <w:color w:val="52575E"/>
+                <w:sz w:val="20"/>
+                <w:szCs w:val="20"/>
+              </w:rPr>
+              <w:t>Google</w:t>
+            </w:r>
+            <w:r>
+              <w:rPr>
+                <w:rFonts w:ascii="Inter 18pt 18pt" w:hAnsi="Inter 18pt 18pt"/>
+                <w:color w:val="52575E"/>
+                <w:sz w:val="20"/>
+                <w:szCs w:val="20"/>
+              </w:rPr>
+              <w:t xml:space="preserve"> – </w:t>
+            </w:r>
+            <w:r>
+              <w:rPr>
+                <w:rFonts w:ascii="Inter 18pt 18pt" w:hAnsi="Inter 18pt 18pt"/>
+                <w:color w:val="52575E"/>
+                <w:sz w:val="20"/>
+                <w:szCs w:val="20"/>
+              </w:rPr>
+              <w:t>Credential ID KU7QS4V348JW</w:t>
+            </w:r>
+          </w:p>
+          <w:p>
+            <w:pPr>
+              <w:snapToGrid w:val="0"/>
+              <w:spacing w:line="300" w:lineRule="auto"/>
+              <w:rPr>
+                <w:rStyle w:val="Hyperlink"/>
+                <w:rFonts w:ascii="Inter 18pt 18pt SemiBold" w:hAnsi="Inter 18pt 18pt SemiBold"/>
+                <w:b/>
+                <w:bCs/>
+              </w:rPr>
+            </w:pPr>
+          </w:p>
+          <w:p>
+            <w:pPr>
+              <w:spacing w:line="300" w:lineRule="auto"/>
+              <w:rPr>
+                <w:rFonts w:ascii="Inter 18pt 18pt SemiBold" w:hAnsi="Inter 18pt 18pt SemiBold"/>
+                <w:b/>
+                <w:bCs/>
+                <w:color w:val="24272E"/>
+              </w:rPr>
+            </w:pPr>
+            <w:hyperlink r:id="rId11" w:history="1">
+              <w:r>
+                <w:rPr>
+                  <w:rStyle w:val="Hyperlink"/>
+                  <w:rFonts w:ascii="Inter 18pt 18pt SemiBold" w:hAnsi="Inter 18pt 18pt SemiBold"/>
+                  <w:b/>
+                  <w:bCs/>
+                </w:rPr>
+                <w:t>TECHNICAL SUPPORT FUNDAMENTALS</w:t>
+              </w:r>
+            </w:hyperlink>
+          </w:p>
+          <w:p>
+            <w:pPr>
+              <w:snapToGrid w:val="0"/>
+              <w:spacing w:line="300" w:lineRule="auto"/>
               <w:rPr>
                 <w:rFonts w:ascii="Inter 18pt 18pt" w:hAnsi="Inter 18pt 18pt"/>
                 <w:color w:val="656B72"/>
                 <w:sz w:val="20"/>
                 <w:szCs w:val="20"/>
               </w:rPr>
-              <w:t>– Present</w:t>
-            </w:r>
-          </w:p>
-          <w:p>
-            <w:pPr>
-              <w:rPr>
-                <w:rFonts w:ascii="Inter 18pt 18pt" w:hAnsi="Inter 18pt 18pt"/>
-                <w:sz w:val="20"/>
-                <w:szCs w:val="20"/>
-              </w:rPr>
-            </w:pPr>
-          </w:p>
-          <w:p>
-            <w:pPr>
-              <w:pStyle w:val="ListParagraph"/>
-              <w:numPr>
-                <w:ilvl w:val="0"/>
-                <w:numId w:val="1"/>
-              </w:numPr>
+            </w:pPr>
+            <w:r>
+              <w:rPr>
+                <w:rFonts w:ascii="Inter 18pt 18pt" w:hAnsi="Inter 18pt 18pt"/>
+                <w:color w:val="656B72"/>
+                <w:sz w:val="20"/>
+                <w:szCs w:val="20"/>
+              </w:rPr>
+              <w:t>May 2022</w:t>
+            </w:r>
+          </w:p>
+          <w:p>
+            <w:pPr>
               <w:snapToGrid w:val="0"/>
-              <w:spacing w:after="80"/>
-              <w:ind w:left="397" w:hanging="227"/>
-              <w:contextualSpacing w:val="0"/>
-              <w:rPr>
-                <w:rFonts w:ascii="Inter 18pt 18pt" w:hAnsi="Inter 18pt 18pt"/>
-                <w:color w:val="52575E"/>
-                <w:sz w:val="20"/>
-                <w:szCs w:val="20"/>
-              </w:rPr>
-            </w:pPr>
-            <w:r>
-              <w:rPr>
-                <w:rFonts w:ascii="Inter 18pt 18pt" w:hAnsi="Inter 18pt 18pt"/>
-                <w:color w:val="52575E"/>
-                <w:sz w:val="20"/>
-                <w:szCs w:val="20"/>
-              </w:rPr>
-              <w:t>Set</w:t>
-            </w:r>
-            <w:r>
-              <w:rPr>
-                <w:rFonts w:ascii="Inter 18pt 18pt" w:hAnsi="Inter 18pt 18pt"/>
-                <w:color w:val="52575E"/>
-                <w:sz w:val="20"/>
-                <w:szCs w:val="20"/>
-              </w:rPr>
-              <w:t xml:space="preserve"> </w:t>
-            </w:r>
-            <w:r>
-              <w:rPr>
-                <w:rFonts w:ascii="Inter 18pt 18pt" w:hAnsi="Inter 18pt 18pt"/>
-                <w:color w:val="52575E"/>
-                <w:sz w:val="20"/>
-                <w:szCs w:val="20"/>
-              </w:rPr>
-              <w:t>up and Administ</w:t>
-            </w:r>
-            <w:r>
-              <w:rPr>
-                <w:rFonts w:ascii="Inter 18pt 18pt" w:hAnsi="Inter 18pt 18pt"/>
-                <w:color w:val="52575E"/>
-                <w:sz w:val="20"/>
-                <w:szCs w:val="20"/>
-              </w:rPr>
-              <w:t xml:space="preserve">ered </w:t>
-            </w:r>
-            <w:r>
-              <w:rPr>
-                <w:rFonts w:ascii="Inter 18pt 18pt" w:hAnsi="Inter 18pt 18pt"/>
-                <w:color w:val="52575E"/>
-                <w:sz w:val="20"/>
-                <w:szCs w:val="20"/>
-              </w:rPr>
-              <w:t>Active Directory</w:t>
-            </w:r>
-          </w:p>
-          <w:p>
-            <w:pPr>
-              <w:pStyle w:val="ListParagraph"/>
-              <w:numPr>
-                <w:ilvl w:val="0"/>
-                <w:numId w:val="1"/>
-              </w:numPr>
-              <w:snapToGrid w:val="0"/>
-              <w:spacing w:after="80"/>
-              <w:ind w:left="397" w:hanging="227"/>
-              <w:contextualSpacing w:val="0"/>
-              <w:rPr>
-                <w:rFonts w:ascii="Inter 18pt 18pt" w:hAnsi="Inter 18pt 18pt"/>
-                <w:color w:val="52575E"/>
-                <w:sz w:val="20"/>
-                <w:szCs w:val="20"/>
-              </w:rPr>
-            </w:pPr>
-            <w:r>
-              <w:rPr>
-                <w:rFonts w:ascii="Inter 18pt 18pt" w:hAnsi="Inter 18pt 18pt"/>
-                <w:color w:val="52575E"/>
-                <w:sz w:val="20"/>
-                <w:szCs w:val="20"/>
-              </w:rPr>
-              <w:t>Integrat</w:t>
-            </w:r>
-            <w:r>
-              <w:rPr>
-                <w:rFonts w:ascii="Inter 18pt 18pt" w:hAnsi="Inter 18pt 18pt"/>
-                <w:color w:val="52575E"/>
-                <w:sz w:val="20"/>
-                <w:szCs w:val="20"/>
-              </w:rPr>
-              <w:t>ed</w:t>
-            </w:r>
-            <w:r>
-              <w:rPr>
-                <w:rFonts w:ascii="Inter 18pt 18pt" w:hAnsi="Inter 18pt 18pt"/>
-                <w:color w:val="52575E"/>
-                <w:sz w:val="20"/>
-                <w:szCs w:val="20"/>
-              </w:rPr>
-              <w:t xml:space="preserve"> ROIP with LTE Network</w:t>
-            </w:r>
-          </w:p>
-          <w:p>
-            <w:pPr>
-              <w:pStyle w:val="ListParagraph"/>
-              <w:numPr>
-                <w:ilvl w:val="0"/>
-                <w:numId w:val="1"/>
-              </w:numPr>
-              <w:snapToGrid w:val="0"/>
-              <w:spacing w:after="80"/>
-              <w:ind w:left="397" w:hanging="227"/>
-              <w:contextualSpacing w:val="0"/>
-              <w:rPr>
-                <w:rFonts w:ascii="Inter 18pt 18pt" w:hAnsi="Inter 18pt 18pt"/>
-                <w:color w:val="52575E"/>
-                <w:sz w:val="20"/>
-                <w:szCs w:val="20"/>
-              </w:rPr>
-            </w:pPr>
-            <w:r>
-              <w:rPr>
-                <w:rFonts w:ascii="Inter 18pt 18pt" w:hAnsi="Inter 18pt 18pt"/>
-                <w:color w:val="52575E"/>
-                <w:sz w:val="20"/>
-                <w:szCs w:val="20"/>
-              </w:rPr>
-              <w:t>Set</w:t>
-            </w:r>
-            <w:r>
-              <w:rPr>
-                <w:rFonts w:ascii="Inter 18pt 18pt" w:hAnsi="Inter 18pt 18pt"/>
-                <w:color w:val="52575E"/>
-                <w:sz w:val="20"/>
-                <w:szCs w:val="20"/>
-              </w:rPr>
-              <w:t xml:space="preserve"> </w:t>
-            </w:r>
-            <w:r>
-              <w:rPr>
-                <w:rFonts w:ascii="Inter 18pt 18pt" w:hAnsi="Inter 18pt 18pt"/>
-                <w:color w:val="52575E"/>
-                <w:sz w:val="20"/>
-                <w:szCs w:val="20"/>
-              </w:rPr>
-              <w:t>up on-premise Cloud Server (</w:t>
-            </w:r>
-            <w:proofErr w:type="spellStart"/>
-            <w:r>
-              <w:rPr>
-                <w:rFonts w:ascii="Inter 18pt 18pt" w:hAnsi="Inter 18pt 18pt"/>
-                <w:color w:val="52575E"/>
-                <w:sz w:val="20"/>
-                <w:szCs w:val="20"/>
-              </w:rPr>
-              <w:t>Nextcloud</w:t>
-            </w:r>
-            <w:proofErr w:type="spellEnd"/>
-            <w:r>
-              <w:rPr>
-                <w:rFonts w:ascii="Inter 18pt 18pt" w:hAnsi="Inter 18pt 18pt"/>
-                <w:color w:val="52575E"/>
-                <w:sz w:val="20"/>
-                <w:szCs w:val="20"/>
-              </w:rPr>
-              <w:t>)</w:t>
-            </w:r>
-          </w:p>
-          <w:p>
-            <w:pPr>
-              <w:pStyle w:val="ListParagraph"/>
-              <w:numPr>
-                <w:ilvl w:val="0"/>
-                <w:numId w:val="1"/>
-              </w:numPr>
-              <w:snapToGrid w:val="0"/>
-              <w:spacing w:after="80"/>
-              <w:ind w:left="397" w:hanging="227"/>
-              <w:contextualSpacing w:val="0"/>
-              <w:rPr>
-                <w:rFonts w:ascii="Inter 18pt 18pt" w:hAnsi="Inter 18pt 18pt"/>
-                <w:color w:val="52575E"/>
-                <w:sz w:val="20"/>
-                <w:szCs w:val="20"/>
-              </w:rPr>
-            </w:pPr>
-            <w:r>
-              <w:rPr>
-                <w:rFonts w:ascii="Inter 18pt 18pt" w:hAnsi="Inter 18pt 18pt"/>
-                <w:color w:val="52575E"/>
-                <w:sz w:val="20"/>
-                <w:szCs w:val="20"/>
-              </w:rPr>
-              <w:t>Implemented, Managed and Operated Software Define Data Centre (VMware vSphere)</w:t>
-            </w:r>
-          </w:p>
-          <w:p>
-            <w:pPr>
-              <w:pStyle w:val="ListParagraph"/>
-              <w:numPr>
-                <w:ilvl w:val="0"/>
-                <w:numId w:val="1"/>
-              </w:numPr>
-              <w:snapToGrid w:val="0"/>
-              <w:spacing w:after="80"/>
-              <w:ind w:left="397" w:hanging="227"/>
-              <w:contextualSpacing w:val="0"/>
-              <w:rPr>
-                <w:rFonts w:ascii="Inter 18pt 18pt" w:hAnsi="Inter 18pt 18pt"/>
-                <w:color w:val="52575E"/>
-                <w:sz w:val="20"/>
-                <w:szCs w:val="20"/>
-              </w:rPr>
-            </w:pPr>
-            <w:r>
-              <w:rPr>
-                <w:rFonts w:ascii="Inter 18pt 18pt" w:hAnsi="Inter 18pt 18pt"/>
-                <w:color w:val="52575E"/>
-                <w:sz w:val="20"/>
-                <w:szCs w:val="20"/>
-                <w:lang w:val="en-GB"/>
-              </w:rPr>
-              <w:t>Administered</w:t>
-            </w:r>
-            <w:r>
-              <w:rPr>
-                <w:rFonts w:ascii="Inter 18pt 18pt" w:hAnsi="Inter 18pt 18pt"/>
-                <w:color w:val="52575E"/>
-                <w:sz w:val="20"/>
-                <w:szCs w:val="20"/>
-              </w:rPr>
-              <w:t xml:space="preserve"> Next Generation Networks </w:t>
-            </w:r>
-            <w:r>
-              <w:rPr>
-                <w:rFonts w:ascii="Inter 18pt 18pt" w:hAnsi="Inter 18pt 18pt"/>
-                <w:color w:val="52575E"/>
-                <w:sz w:val="20"/>
-                <w:szCs w:val="20"/>
-              </w:rPr>
-              <w:t>(Cisco and Huawei)</w:t>
-            </w:r>
-          </w:p>
-          <w:p>
-            <w:pPr>
-              <w:pStyle w:val="ListParagraph"/>
-              <w:numPr>
-                <w:ilvl w:val="0"/>
-                <w:numId w:val="1"/>
-              </w:numPr>
-              <w:snapToGrid w:val="0"/>
-              <w:spacing w:after="80"/>
-              <w:ind w:left="397" w:hanging="227"/>
-              <w:contextualSpacing w:val="0"/>
-              <w:rPr>
-                <w:rFonts w:ascii="Inter 18pt 18pt" w:hAnsi="Inter 18pt 18pt"/>
-                <w:color w:val="52575E"/>
-                <w:sz w:val="20"/>
-                <w:szCs w:val="20"/>
-              </w:rPr>
-            </w:pPr>
-            <w:r>
-              <w:rPr>
-                <w:rFonts w:ascii="Inter 18pt 18pt" w:hAnsi="Inter 18pt 18pt"/>
-                <w:color w:val="52575E"/>
-                <w:sz w:val="20"/>
-                <w:szCs w:val="20"/>
-                <w:lang w:val="en-GB"/>
-              </w:rPr>
-              <w:t>Administered</w:t>
-            </w:r>
-            <w:r>
-              <w:rPr>
-                <w:rFonts w:ascii="Inter 18pt 18pt" w:hAnsi="Inter 18pt 18pt"/>
-                <w:color w:val="52575E"/>
-                <w:sz w:val="20"/>
-                <w:szCs w:val="20"/>
-              </w:rPr>
-              <w:t xml:space="preserve"> POTS and IPX Systems </w:t>
-            </w:r>
-          </w:p>
-          <w:p>
-            <w:pPr>
-              <w:pStyle w:val="ListParagraph"/>
-              <w:numPr>
-                <w:ilvl w:val="0"/>
-                <w:numId w:val="1"/>
-              </w:numPr>
-              <w:snapToGrid w:val="0"/>
-              <w:spacing w:after="80" w:line="278" w:lineRule="auto"/>
-              <w:ind w:left="397" w:hanging="227"/>
-              <w:rPr>
-                <w:rFonts w:ascii="Inter 18pt 18pt" w:hAnsi="Inter 18pt 18pt"/>
-                <w:color w:val="52575E"/>
-                <w:sz w:val="20"/>
-                <w:szCs w:val="20"/>
-                <w:lang w:val="en-PK"/>
-              </w:rPr>
-            </w:pPr>
-            <w:r>
-              <w:rPr>
-                <w:rFonts w:ascii="Inter 18pt 18pt" w:hAnsi="Inter 18pt 18pt"/>
-                <w:color w:val="52575E"/>
-                <w:sz w:val="20"/>
-                <w:szCs w:val="20"/>
-                <w:lang w:val="en-GB"/>
-              </w:rPr>
-              <w:t>Administered</w:t>
-            </w:r>
-            <w:r>
-              <w:rPr>
-                <w:rFonts w:ascii="Inter 18pt 18pt" w:hAnsi="Inter 18pt 18pt"/>
-                <w:color w:val="52575E"/>
-                <w:sz w:val="20"/>
-                <w:szCs w:val="20"/>
-                <w:lang w:val="en-PK"/>
-              </w:rPr>
-              <w:t xml:space="preserve"> LTE EPC and eUTRAN</w:t>
-            </w:r>
-          </w:p>
-          <w:p>
-            <w:pPr>
-              <w:pStyle w:val="ListParagraph"/>
-              <w:numPr>
-                <w:ilvl w:val="0"/>
-                <w:numId w:val="1"/>
-              </w:numPr>
-              <w:snapToGrid w:val="0"/>
-              <w:spacing w:after="80"/>
-              <w:ind w:left="397" w:hanging="227"/>
-              <w:rPr>
-                <w:rFonts w:ascii="Inter 18pt 18pt" w:hAnsi="Inter 18pt 18pt"/>
-                <w:color w:val="52575E"/>
-                <w:sz w:val="20"/>
-                <w:szCs w:val="20"/>
-                <w:lang w:val="en-PK"/>
-              </w:rPr>
-            </w:pPr>
-            <w:r>
-              <w:rPr>
-                <w:rFonts w:ascii="Inter 18pt 18pt" w:hAnsi="Inter 18pt 18pt"/>
-                <w:color w:val="52575E"/>
-                <w:sz w:val="20"/>
-                <w:szCs w:val="20"/>
-                <w:lang w:val="en-GB"/>
-              </w:rPr>
-              <w:t>Operated and Administered OFC infrastructure</w:t>
+              <w:rPr>
+                <w:rFonts w:ascii="Inter 18pt 18pt" w:hAnsi="Inter 18pt 18pt"/>
+                <w:color w:val="52575E"/>
+                <w:sz w:val="20"/>
+                <w:szCs w:val="20"/>
+              </w:rPr>
+            </w:pPr>
+            <w:r>
+              <w:rPr>
+                <w:rFonts w:ascii="Inter 18pt 18pt" w:hAnsi="Inter 18pt 18pt"/>
+                <w:color w:val="52575E"/>
+                <w:sz w:val="20"/>
+                <w:szCs w:val="20"/>
+              </w:rPr>
+              <w:t>Google</w:t>
+            </w:r>
+            <w:r>
+              <w:rPr>
+                <w:rFonts w:ascii="Inter 18pt 18pt" w:hAnsi="Inter 18pt 18pt"/>
+                <w:color w:val="52575E"/>
+                <w:sz w:val="20"/>
+                <w:szCs w:val="20"/>
+              </w:rPr>
+              <w:t xml:space="preserve"> – </w:t>
+            </w:r>
+            <w:r>
+              <w:rPr>
+                <w:rFonts w:ascii="Inter 18pt 18pt" w:hAnsi="Inter 18pt 18pt"/>
+                <w:color w:val="52575E"/>
+                <w:sz w:val="20"/>
+                <w:szCs w:val="20"/>
+              </w:rPr>
+              <w:t>Credential ID CA5QK4NMHGNU</w:t>
             </w:r>
           </w:p>
           <w:p>
@@ -1946,12 +2257,11 @@
                 <w:sz w:val="28"/>
                 <w:szCs w:val="28"/>
               </w:rPr>
-              <w:t>Professional Courses</w:t>
-            </w:r>
-          </w:p>
-          <w:p>
-            <w:pPr>
-              <w:snapToGrid w:val="0"/>
+              <w:t>Education</w:t>
+            </w:r>
+          </w:p>
+          <w:p>
+            <w:pPr>
               <w:rPr>
                 <w:rFonts w:ascii="Inter 18pt 18pt" w:hAnsi="Inter 18pt 18pt"/>
                 <w:sz w:val="32"/>
@@ -1971,18 +2281,24 @@
               <mc:AlternateContent>
                 <mc:Choice Requires="wps">
                   <w:drawing>
-                    <wp:anchor distT="0" distB="0" distL="114300" distR="114300" simplePos="0" relativeHeight="251669504" behindDoc="0" locked="0" layoutInCell="1" allowOverlap="1" wp14:anchorId="64A9AF74" wp14:editId="4BA25006">
+                    <wp:anchor distT="0" distB="0" distL="114300" distR="114300" simplePos="0" relativeHeight="251680768" behindDoc="0" locked="0" layoutInCell="1" allowOverlap="1" wp14:anchorId="618774F4" wp14:editId="02E9BD26">
                       <wp:simplePos x="0" y="0"/>
                       <wp:positionH relativeFrom="column">
-                        <wp:posOffset>-131919</wp:posOffset>
+                        <wp:posOffset>-132876</wp:posOffset>
                       </wp:positionH>
                       <wp:positionV relativeFrom="paragraph">
-                        <wp:posOffset>85090</wp:posOffset>
+                        <wp:posOffset>46355</wp:posOffset>
                       </wp:positionV>
                       <wp:extent cx="7092000" cy="0"/>
                       <wp:effectExtent l="0" t="19050" r="33020" b="19050"/>
                       <wp:wrapNone/>
-                      <wp:docPr id="1542576244" name="Straight Connector 32"/>
+                      <wp:docPr id="1103464770" name="Straight Connector 32">
+                        <a:extLst xmlns:a="http://schemas.openxmlformats.org/drawingml/2006/main">
+                          <a:ext uri="{C183D7F6-B498-43B3-948B-1728B52AA6E4}">
+                            <adec:decorative xmlns:adec="http://schemas.microsoft.com/office/drawing/2017/decorative" val="1"/>
+                          </a:ext>
+                        </a:extLst>
+                      </wp:docPr>
                       <wp:cNvGraphicFramePr/>
                       <a:graphic xmlns:a="http://schemas.openxmlformats.org/drawingml/2006/main">
                         <a:graphicData uri="http://schemas.microsoft.com/office/word/2010/wordprocessingShape">
@@ -2028,7 +2344,7 @@
                 </mc:Choice>
                 <mc:Fallback>
                   <w:pict>
-                    <v:line w14:anchorId="7CEA1EE7" id="Straight Connector 32" o:spid="_x0000_s1026" style="position:absolute;z-index:251669504;visibility:visible;mso-wrap-style:square;mso-width-percent:0;mso-wrap-distance-left:9pt;mso-wrap-distance-top:0;mso-wrap-distance-right:9pt;mso-wrap-distance-bottom:0;mso-position-horizontal:absolute;mso-position-horizontal-relative:text;mso-position-vertical:absolute;mso-position-vertical-relative:text;mso-width-percent:0;mso-width-relative:margin" from="-10.4pt,6.7pt" to="548.05pt,6.7pt" o:gfxdata="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" strokecolor="#cbcfd4" strokeweight="3pt">
+                    <v:line w14:anchorId="580793B7" id="Straight Connector 32" o:spid="_x0000_s1026" alt="&quot;&quot;" style="position:absolute;z-index:251680768;visibility:visible;mso-wrap-style:square;mso-width-percent:0;mso-wrap-distance-left:9pt;mso-wrap-distance-top:0;mso-wrap-distance-right:9pt;mso-wrap-distance-bottom:0;mso-position-horizontal:absolute;mso-position-horizontal-relative:text;mso-position-vertical:absolute;mso-position-vertical-relative:text;mso-width-percent:0;mso-width-relative:margin" from="-10.45pt,3.65pt" to="548pt,3.65pt" o:gfxdata="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" strokecolor="#cbcfd4" strokeweight="3pt">
                       <v:stroke joinstyle="miter"/>
                     </v:line>
                   </w:pict>
@@ -2038,7 +2354,7 @@
           </w:p>
           <w:p>
             <w:pPr>
-              <w:spacing w:line="300" w:lineRule="auto"/>
+              <w:spacing w:line="360" w:lineRule="auto"/>
               <w:rPr>
                 <w:rFonts w:ascii="Inter 18pt 18pt SemiBold" w:hAnsi="Inter 18pt 18pt SemiBold"/>
                 <w:b/>
@@ -2046,299 +2362,28 @@
                 <w:color w:val="24272E"/>
               </w:rPr>
             </w:pPr>
-            <w:hyperlink r:id="rId8" w:history="1">
-              <w:r>
-                <w:rPr>
-                  <w:rStyle w:val="Hyperlink"/>
-                  <w:rFonts w:ascii="Inter 18pt 18pt SemiBold" w:hAnsi="Inter 18pt 18pt SemiBold"/>
-                  <w:b/>
-                  <w:bCs/>
-                </w:rPr>
-                <w:t>4G NETWORK FUNDAMENTALS</w:t>
-              </w:r>
-            </w:hyperlink>
-          </w:p>
-          <w:p>
-            <w:pPr>
-              <w:snapToGrid w:val="0"/>
-              <w:spacing w:line="300" w:lineRule="auto"/>
-              <w:rPr>
-                <w:rFonts w:ascii="Inter 18pt 18pt" w:hAnsi="Inter 18pt 18pt"/>
-                <w:color w:val="52575E"/>
-                <w:sz w:val="20"/>
-                <w:szCs w:val="20"/>
-              </w:rPr>
-            </w:pPr>
-            <w:r>
-              <w:rPr>
-                <w:rFonts w:ascii="Inter 18pt 18pt" w:hAnsi="Inter 18pt 18pt"/>
-                <w:color w:val="656B72"/>
-                <w:sz w:val="20"/>
-                <w:szCs w:val="20"/>
-              </w:rPr>
-              <w:t>Mar 20</w:t>
-            </w:r>
-            <w:r>
-              <w:rPr>
-                <w:rFonts w:ascii="Inter 18pt 18pt" w:hAnsi="Inter 18pt 18pt"/>
-                <w:color w:val="656B72"/>
-                <w:sz w:val="20"/>
-                <w:szCs w:val="20"/>
-              </w:rPr>
-              <w:t>25</w:t>
-            </w:r>
-            <w:r>
-              <w:rPr>
-                <w:rFonts w:ascii="Inter 18pt 18pt" w:hAnsi="Inter 18pt 18pt"/>
-                <w:color w:val="656B72"/>
-                <w:sz w:val="20"/>
-                <w:szCs w:val="20"/>
-              </w:rPr>
-              <w:br/>
-            </w:r>
-            <w:proofErr w:type="spellStart"/>
-            <w:r>
-              <w:rPr>
-                <w:rFonts w:ascii="Inter 18pt 18pt" w:hAnsi="Inter 18pt 18pt"/>
-                <w:color w:val="24272E"/>
-                <w:sz w:val="20"/>
-                <w:szCs w:val="20"/>
-              </w:rPr>
-              <w:t>Institut</w:t>
-            </w:r>
-            <w:proofErr w:type="spellEnd"/>
-            <w:r>
-              <w:rPr>
-                <w:rFonts w:ascii="Inter 18pt 18pt" w:hAnsi="Inter 18pt 18pt"/>
-                <w:color w:val="24272E"/>
-                <w:sz w:val="20"/>
-                <w:szCs w:val="20"/>
-              </w:rPr>
-              <w:t xml:space="preserve"> Mines-</w:t>
-            </w:r>
-            <w:proofErr w:type="spellStart"/>
-            <w:r>
-              <w:rPr>
-                <w:rFonts w:ascii="Inter 18pt 18pt" w:hAnsi="Inter 18pt 18pt"/>
-                <w:color w:val="24272E"/>
-                <w:sz w:val="20"/>
-                <w:szCs w:val="20"/>
-              </w:rPr>
-              <w:t>Télécom</w:t>
-            </w:r>
-            <w:proofErr w:type="spellEnd"/>
-            <w:r>
-              <w:rPr>
-                <w:rFonts w:ascii="Inter 18pt 18pt" w:hAnsi="Inter 18pt 18pt"/>
-                <w:color w:val="24272E"/>
-                <w:sz w:val="20"/>
-                <w:szCs w:val="20"/>
-              </w:rPr>
-              <w:t xml:space="preserve"> (IMT)</w:t>
-            </w:r>
-            <w:r>
-              <w:rPr>
-                <w:rFonts w:ascii="Inter 18pt 18pt" w:hAnsi="Inter 18pt 18pt"/>
-                <w:color w:val="24272E"/>
-                <w:sz w:val="20"/>
-                <w:szCs w:val="20"/>
-              </w:rPr>
-              <w:t xml:space="preserve"> </w:t>
-            </w:r>
-            <w:r>
-              <w:rPr>
-                <w:rFonts w:ascii="Inter 18pt 18pt" w:hAnsi="Inter 18pt 18pt"/>
-                <w:color w:val="24272E"/>
-                <w:sz w:val="20"/>
-                <w:szCs w:val="20"/>
-              </w:rPr>
-              <w:t>–</w:t>
-            </w:r>
-            <w:r>
-              <w:rPr>
-                <w:rFonts w:ascii="Inter 18pt 18pt" w:hAnsi="Inter 18pt 18pt"/>
-                <w:color w:val="24272E"/>
-                <w:sz w:val="20"/>
-                <w:szCs w:val="20"/>
-              </w:rPr>
-              <w:t xml:space="preserve"> </w:t>
-            </w:r>
-            <w:r>
-              <w:rPr>
-                <w:rFonts w:ascii="Inter 18pt 18pt" w:hAnsi="Inter 18pt 18pt"/>
-                <w:color w:val="24272E"/>
-                <w:sz w:val="20"/>
-                <w:szCs w:val="20"/>
-              </w:rPr>
-              <w:t>Credential</w:t>
-            </w:r>
-            <w:r>
-              <w:rPr>
-                <w:rFonts w:ascii="Inter 18pt 18pt" w:hAnsi="Inter 18pt 18pt"/>
-                <w:color w:val="24272E"/>
-                <w:sz w:val="20"/>
-                <w:szCs w:val="20"/>
-              </w:rPr>
-              <w:t xml:space="preserve"> </w:t>
-            </w:r>
-            <w:r>
-              <w:rPr>
-                <w:rFonts w:ascii="Inter 18pt 18pt" w:hAnsi="Inter 18pt 18pt"/>
-                <w:color w:val="24272E"/>
-                <w:sz w:val="20"/>
-                <w:szCs w:val="20"/>
-              </w:rPr>
-              <w:t>ID RVSJFBEWR6IA</w:t>
-            </w:r>
-          </w:p>
-          <w:p>
-            <w:pPr>
-              <w:snapToGrid w:val="0"/>
-              <w:spacing w:after="80"/>
-              <w:rPr>
-                <w:rFonts w:ascii="Inter 18pt 18pt" w:hAnsi="Inter 18pt 18pt"/>
-                <w:sz w:val="20"/>
-                <w:szCs w:val="20"/>
-              </w:rPr>
-            </w:pPr>
-          </w:p>
-          <w:p>
-            <w:pPr>
-              <w:spacing w:line="300" w:lineRule="auto"/>
+            <w:r>
               <w:rPr>
                 <w:rFonts w:ascii="Inter 18pt 18pt SemiBold" w:hAnsi="Inter 18pt 18pt SemiBold"/>
                 <w:b/>
                 <w:bCs/>
                 <w:color w:val="24272E"/>
               </w:rPr>
-            </w:pPr>
-            <w:hyperlink r:id="rId9" w:history="1">
-              <w:r>
-                <w:rPr>
-                  <w:rStyle w:val="Hyperlink"/>
-                  <w:rFonts w:ascii="Inter 18pt 18pt SemiBold" w:hAnsi="Inter 18pt 18pt SemiBold"/>
-                  <w:b/>
-                  <w:bCs/>
-                </w:rPr>
-                <w:t>FOUNDATIONS OF CYBERSECURITY</w:t>
-              </w:r>
-            </w:hyperlink>
-          </w:p>
-          <w:p>
-            <w:pPr>
-              <w:snapToGrid w:val="0"/>
-              <w:spacing w:line="300" w:lineRule="auto"/>
-              <w:rPr>
-                <w:rFonts w:ascii="Inter 18pt 18pt" w:hAnsi="Inter 18pt 18pt"/>
-                <w:color w:val="656B72"/>
-                <w:sz w:val="20"/>
-                <w:szCs w:val="20"/>
-              </w:rPr>
-            </w:pPr>
-            <w:r>
-              <w:rPr>
-                <w:rFonts w:ascii="Inter 18pt 18pt" w:hAnsi="Inter 18pt 18pt"/>
-                <w:color w:val="656B72"/>
-                <w:sz w:val="20"/>
-                <w:szCs w:val="20"/>
-              </w:rPr>
-              <w:lastRenderedPageBreak/>
-              <w:t>Oct 2023</w:t>
-            </w:r>
-          </w:p>
-          <w:p>
-            <w:pPr>
-              <w:snapToGrid w:val="0"/>
-              <w:rPr>
-                <w:rFonts w:ascii="Inter 18pt 18pt" w:hAnsi="Inter 18pt 18pt"/>
-                <w:color w:val="52575E"/>
-                <w:sz w:val="20"/>
-                <w:szCs w:val="20"/>
-              </w:rPr>
-            </w:pPr>
-            <w:r>
-              <w:rPr>
-                <w:rFonts w:ascii="Inter 18pt 18pt" w:hAnsi="Inter 18pt 18pt"/>
-                <w:color w:val="52575E"/>
-                <w:sz w:val="20"/>
-                <w:szCs w:val="20"/>
-              </w:rPr>
-              <w:t>Google</w:t>
-            </w:r>
-            <w:r>
-              <w:rPr>
-                <w:rFonts w:ascii="Inter 18pt 18pt" w:hAnsi="Inter 18pt 18pt"/>
-                <w:color w:val="52575E"/>
-                <w:sz w:val="20"/>
-                <w:szCs w:val="20"/>
-              </w:rPr>
-              <w:t xml:space="preserve"> – </w:t>
-            </w:r>
-            <w:r>
-              <w:rPr>
-                <w:rFonts w:ascii="Inter 18pt 18pt" w:hAnsi="Inter 18pt 18pt"/>
-                <w:color w:val="52575E"/>
-                <w:sz w:val="20"/>
-                <w:szCs w:val="20"/>
-              </w:rPr>
-              <w:t>Credential</w:t>
-            </w:r>
-            <w:r>
-              <w:rPr>
-                <w:rFonts w:ascii="Inter 18pt 18pt" w:hAnsi="Inter 18pt 18pt"/>
-                <w:color w:val="52575E"/>
-                <w:sz w:val="20"/>
-                <w:szCs w:val="20"/>
-              </w:rPr>
-              <w:t xml:space="preserve"> </w:t>
-            </w:r>
-            <w:r>
-              <w:rPr>
-                <w:rFonts w:ascii="Inter 18pt 18pt" w:hAnsi="Inter 18pt 18pt"/>
-                <w:color w:val="52575E"/>
-                <w:sz w:val="20"/>
-                <w:szCs w:val="20"/>
-              </w:rPr>
-              <w:t>ID LAN7856EY6R4</w:t>
-            </w:r>
-          </w:p>
-          <w:p>
-            <w:pPr>
-              <w:spacing w:line="300" w:lineRule="auto"/>
-              <w:rPr>
-                <w:rStyle w:val="Hyperlink"/>
-                <w:rFonts w:ascii="Inter 18pt 18pt SemiBold" w:hAnsi="Inter 18pt 18pt SemiBold"/>
-                <w:b/>
-                <w:bCs/>
-              </w:rPr>
-            </w:pPr>
-          </w:p>
-          <w:p>
-            <w:pPr>
-              <w:spacing w:line="300" w:lineRule="auto"/>
+              <w:t>BE</w:t>
+            </w:r>
+            <w:r>
               <w:rPr>
                 <w:rFonts w:ascii="Inter 18pt 18pt SemiBold" w:hAnsi="Inter 18pt 18pt SemiBold"/>
                 <w:b/>
                 <w:bCs/>
                 <w:color w:val="24272E"/>
               </w:rPr>
-            </w:pPr>
-            <w:hyperlink r:id="rId10" w:history="1">
-              <w:r>
-                <w:rPr>
-                  <w:rStyle w:val="Hyperlink"/>
-                  <w:rFonts w:ascii="Inter 18pt 18pt SemiBold" w:hAnsi="Inter 18pt 18pt SemiBold"/>
-                  <w:b/>
-                  <w:bCs/>
-                </w:rPr>
-                <w:t>THE BITS AND BYTES OF COMPUTER NETWORKING</w:t>
-              </w:r>
-            </w:hyperlink>
-          </w:p>
-          <w:p>
-            <w:pPr>
-              <w:snapToGrid w:val="0"/>
-              <w:spacing w:line="300" w:lineRule="auto"/>
+              <w:t>. AVIONICS</w:t>
+            </w:r>
+          </w:p>
+          <w:p>
+            <w:pPr>
+              <w:spacing w:line="360" w:lineRule="auto"/>
               <w:rPr>
                 <w:rFonts w:ascii="Inter 18pt 18pt" w:hAnsi="Inter 18pt 18pt"/>
                 <w:color w:val="656B72"/>
@@ -2349,142 +2394,102 @@
             <w:r>
               <w:rPr>
                 <w:rFonts w:ascii="Inter 18pt 18pt" w:hAnsi="Inter 18pt 18pt"/>
+                <w:color w:val="3B3E45"/>
+                <w:sz w:val="20"/>
+                <w:szCs w:val="20"/>
+              </w:rPr>
+              <w:t xml:space="preserve">CAE, </w:t>
+            </w:r>
+            <w:r>
+              <w:rPr>
+                <w:rFonts w:ascii="Inter 18pt 18pt" w:hAnsi="Inter 18pt 18pt"/>
+                <w:color w:val="3B3E45"/>
+                <w:sz w:val="20"/>
+                <w:szCs w:val="20"/>
+              </w:rPr>
+              <w:t xml:space="preserve">National University of Sciences and Technology </w:t>
+            </w:r>
+            <w:r>
+              <w:rPr>
+                <w:rFonts w:ascii="Inter 18pt 18pt" w:hAnsi="Inter 18pt 18pt"/>
+                <w:color w:val="3B3E45"/>
+                <w:sz w:val="20"/>
+                <w:szCs w:val="20"/>
+              </w:rPr>
+              <w:t>(</w:t>
+            </w:r>
+            <w:r>
+              <w:rPr>
+                <w:rFonts w:ascii="Inter 18pt 18pt" w:hAnsi="Inter 18pt 18pt"/>
+                <w:color w:val="3B3E45"/>
+                <w:sz w:val="20"/>
+                <w:szCs w:val="20"/>
+              </w:rPr>
+              <w:t>NUST</w:t>
+            </w:r>
+            <w:r>
+              <w:rPr>
+                <w:rFonts w:ascii="Inter 18pt 18pt" w:hAnsi="Inter 18pt 18pt"/>
+                <w:color w:val="3B3E45"/>
+                <w:sz w:val="20"/>
+                <w:szCs w:val="20"/>
+              </w:rPr>
+              <w:t>), IBD</w:t>
+            </w:r>
+            <w:r>
+              <w:rPr>
+                <w:rFonts w:ascii="Inter 18pt 18pt" w:hAnsi="Inter 18pt 18pt"/>
+                <w:color w:val="3B3E45"/>
+                <w:sz w:val="20"/>
+                <w:szCs w:val="20"/>
+              </w:rPr>
+              <w:t xml:space="preserve"> </w:t>
+            </w:r>
+            <w:r>
+              <w:rPr>
+                <w:rFonts w:ascii="Inter 18pt 18pt" w:hAnsi="Inter 18pt 18pt"/>
                 <w:color w:val="656B72"/>
                 <w:sz w:val="20"/>
                 <w:szCs w:val="20"/>
               </w:rPr>
-              <w:t>Oct 2023</w:t>
-            </w:r>
-          </w:p>
-          <w:p>
-            <w:pPr>
-              <w:snapToGrid w:val="0"/>
-              <w:rPr>
-                <w:rFonts w:ascii="Inter 18pt 18pt" w:hAnsi="Inter 18pt 18pt"/>
-                <w:color w:val="52575E"/>
-                <w:sz w:val="20"/>
-                <w:szCs w:val="20"/>
-              </w:rPr>
-            </w:pPr>
-            <w:r>
-              <w:rPr>
-                <w:rFonts w:ascii="Inter 18pt 18pt" w:hAnsi="Inter 18pt 18pt"/>
-                <w:color w:val="52575E"/>
-                <w:sz w:val="20"/>
-                <w:szCs w:val="20"/>
-              </w:rPr>
-              <w:t>Google</w:t>
-            </w:r>
-            <w:r>
-              <w:rPr>
-                <w:rFonts w:ascii="Inter 18pt 18pt" w:hAnsi="Inter 18pt 18pt"/>
-                <w:color w:val="52575E"/>
-                <w:sz w:val="20"/>
-                <w:szCs w:val="20"/>
-              </w:rPr>
-              <w:t xml:space="preserve"> – </w:t>
-            </w:r>
-            <w:r>
-              <w:rPr>
-                <w:rFonts w:ascii="Inter 18pt 18pt" w:hAnsi="Inter 18pt 18pt"/>
-                <w:color w:val="52575E"/>
-                <w:sz w:val="20"/>
-                <w:szCs w:val="20"/>
-              </w:rPr>
-              <w:t>Credential ID KU7QS4V348JW</w:t>
-            </w:r>
-          </w:p>
-          <w:p>
-            <w:pPr>
-              <w:snapToGrid w:val="0"/>
-              <w:spacing w:line="300" w:lineRule="auto"/>
-              <w:rPr>
-                <w:rStyle w:val="Hyperlink"/>
-                <w:rFonts w:ascii="Inter 18pt 18pt SemiBold" w:hAnsi="Inter 18pt 18pt SemiBold"/>
-                <w:b/>
-                <w:bCs/>
-              </w:rPr>
-            </w:pPr>
-          </w:p>
-          <w:p>
-            <w:pPr>
-              <w:spacing w:line="300" w:lineRule="auto"/>
-              <w:rPr>
-                <w:rFonts w:ascii="Inter 18pt 18pt SemiBold" w:hAnsi="Inter 18pt 18pt SemiBold"/>
-                <w:b/>
-                <w:bCs/>
+              <w:t xml:space="preserve">| </w:t>
+            </w:r>
+            <w:r>
+              <w:rPr>
+                <w:rFonts w:ascii="Inter 18pt 18pt" w:hAnsi="Inter 18pt 18pt"/>
+                <w:color w:val="656B72"/>
+                <w:sz w:val="20"/>
+                <w:szCs w:val="20"/>
+              </w:rPr>
+              <w:t>November 2018 - October 2022</w:t>
+            </w:r>
+          </w:p>
+          <w:p>
+            <w:pPr>
+              <w:rPr>
+                <w:rFonts w:ascii="Inter 18pt 18pt" w:hAnsi="Inter 18pt 18pt"/>
                 <w:color w:val="24272E"/>
-              </w:rPr>
-            </w:pPr>
-            <w:hyperlink r:id="rId11" w:history="1">
-              <w:r>
-                <w:rPr>
-                  <w:rStyle w:val="Hyperlink"/>
-                  <w:rFonts w:ascii="Inter 18pt 18pt SemiBold" w:hAnsi="Inter 18pt 18pt SemiBold"/>
-                  <w:b/>
-                  <w:bCs/>
-                </w:rPr>
-                <w:t>TECHNICAL SUPPORT FUNDAMENTALS</w:t>
-              </w:r>
-            </w:hyperlink>
-          </w:p>
-          <w:p>
-            <w:pPr>
-              <w:snapToGrid w:val="0"/>
-              <w:spacing w:line="300" w:lineRule="auto"/>
-              <w:rPr>
-                <w:rFonts w:ascii="Inter 18pt 18pt" w:hAnsi="Inter 18pt 18pt"/>
-                <w:color w:val="656B72"/>
-                <w:sz w:val="20"/>
-                <w:szCs w:val="20"/>
-              </w:rPr>
-            </w:pPr>
-            <w:r>
-              <w:rPr>
-                <w:rFonts w:ascii="Inter 18pt 18pt" w:hAnsi="Inter 18pt 18pt"/>
-                <w:color w:val="656B72"/>
-                <w:sz w:val="20"/>
-                <w:szCs w:val="20"/>
-              </w:rPr>
-              <w:t>May 2022</w:t>
-            </w:r>
-          </w:p>
-          <w:p>
-            <w:pPr>
-              <w:snapToGrid w:val="0"/>
-              <w:rPr>
-                <w:rFonts w:ascii="Inter 18pt 18pt" w:hAnsi="Inter 18pt 18pt"/>
-                <w:color w:val="52575E"/>
-                <w:sz w:val="20"/>
-                <w:szCs w:val="20"/>
-              </w:rPr>
-            </w:pPr>
-            <w:r>
-              <w:rPr>
-                <w:rFonts w:ascii="Inter 18pt 18pt" w:hAnsi="Inter 18pt 18pt"/>
-                <w:color w:val="52575E"/>
-                <w:sz w:val="20"/>
-                <w:szCs w:val="20"/>
-              </w:rPr>
-              <w:t>Google</w:t>
-            </w:r>
-            <w:r>
-              <w:rPr>
-                <w:rFonts w:ascii="Inter 18pt 18pt" w:hAnsi="Inter 18pt 18pt"/>
-                <w:color w:val="52575E"/>
-                <w:sz w:val="20"/>
-                <w:szCs w:val="20"/>
-              </w:rPr>
-              <w:t xml:space="preserve"> – </w:t>
-            </w:r>
-            <w:r>
-              <w:rPr>
-                <w:rFonts w:ascii="Inter 18pt 18pt" w:hAnsi="Inter 18pt 18pt"/>
-                <w:color w:val="52575E"/>
-                <w:sz w:val="20"/>
-                <w:szCs w:val="20"/>
-              </w:rPr>
-              <w:t>Credential ID CA5QK4NMHGNU</w:t>
+                <w:sz w:val="20"/>
+                <w:szCs w:val="20"/>
+              </w:rPr>
+            </w:pPr>
+            <w:r>
+              <w:rPr>
+                <w:rFonts w:ascii="Inter 18pt 18pt" w:hAnsi="Inter 18pt 18pt"/>
+                <w:color w:val="24272E"/>
+                <w:sz w:val="20"/>
+                <w:szCs w:val="20"/>
+              </w:rPr>
+              <w:t>Bachelor of Engineering - Avionics</w:t>
+            </w:r>
+            <w:r>
+              <w:rPr>
+                <w:rFonts w:ascii="Inter 18pt 18pt" w:hAnsi="Inter 18pt 18pt"/>
+                <w:color w:val="24272E"/>
+                <w:sz w:val="20"/>
+                <w:szCs w:val="20"/>
+              </w:rPr>
+              <w:t xml:space="preserve"> Engineering – Majors: Engineering Circuit Analysis, Data Communication &amp; Networks, Analogue and Digital Communications, Avionics System Design, Microwave and Antenna Theory </w:t>
             </w:r>
           </w:p>
           <w:p>
@@ -2518,93 +2523,6 @@
                 <w:szCs w:val="28"/>
               </w:rPr>
               <w:t>Skills</w:t>
-            </w:r>
-          </w:p>
-          <w:p>
-            <w:pPr>
-              <w:rPr>
-                <w:rFonts w:ascii="Inter 18pt 18pt" w:hAnsi="Inter 18pt 18pt" w:cs="Times New Roman (Body CS)"/>
-                <w:b/>
-                <w:bCs/>
-                <w:color w:val="81311A"/>
-                <w:spacing w:val="20"/>
-                <w:sz w:val="32"/>
-                <w:szCs w:val="32"/>
-              </w:rPr>
-            </w:pPr>
-            <w:r>
-              <w:rPr>
-                <w:rFonts w:cs="Times New Roman (Body CS)"/>
-                <w:b/>
-                <w:bCs/>
-                <w:noProof/>
-                <w:color w:val="81311A"/>
-                <w:sz w:val="28"/>
-                <w:szCs w:val="28"/>
-              </w:rPr>
-              <mc:AlternateContent>
-                <mc:Choice Requires="wps">
-                  <w:drawing>
-                    <wp:anchor distT="0" distB="0" distL="114300" distR="114300" simplePos="0" relativeHeight="251678720" behindDoc="0" locked="0" layoutInCell="1" allowOverlap="1" wp14:anchorId="5F80219F" wp14:editId="127473FE">
-                      <wp:simplePos x="0" y="0"/>
-                      <wp:positionH relativeFrom="column">
-                        <wp:posOffset>-4445</wp:posOffset>
-                      </wp:positionH>
-                      <wp:positionV relativeFrom="paragraph">
-                        <wp:posOffset>81915</wp:posOffset>
-                      </wp:positionV>
-                      <wp:extent cx="7091680" cy="0"/>
-                      <wp:effectExtent l="0" t="19050" r="33020" b="19050"/>
-                      <wp:wrapNone/>
-                      <wp:docPr id="1605575555" name="Straight Connector 32"/>
-                      <wp:cNvGraphicFramePr/>
-                      <a:graphic xmlns:a="http://schemas.openxmlformats.org/drawingml/2006/main">
-                        <a:graphicData uri="http://schemas.microsoft.com/office/word/2010/wordprocessingShape">
-                          <wps:wsp>
-                            <wps:cNvCnPr/>
-                            <wps:spPr>
-                              <a:xfrm>
-                                <a:off x="0" y="0"/>
-                                <a:ext cx="7091680" cy="0"/>
-                              </a:xfrm>
-                              <a:prstGeom prst="line">
-                                <a:avLst/>
-                              </a:prstGeom>
-                              <a:ln w="38100">
-                                <a:solidFill>
-                                  <a:srgbClr val="CBCFD4"/>
-                                </a:solidFill>
-                              </a:ln>
-                            </wps:spPr>
-                            <wps:style>
-                              <a:lnRef idx="2">
-                                <a:schemeClr val="accent1"/>
-                              </a:lnRef>
-                              <a:fillRef idx="0">
-                                <a:schemeClr val="accent1"/>
-                              </a:fillRef>
-                              <a:effectRef idx="1">
-                                <a:schemeClr val="accent1"/>
-                              </a:effectRef>
-                              <a:fontRef idx="minor">
-                                <a:schemeClr val="tx1"/>
-                              </a:fontRef>
-                            </wps:style>
-                            <wps:bodyPr/>
-                          </wps:wsp>
-                        </a:graphicData>
-                      </a:graphic>
-                    </wp:anchor>
-                  </w:drawing>
-                </mc:Choice>
-                <mc:Fallback>
-                  <w:pict>
-                    <v:line w14:anchorId="21020DED" id="Straight Connector 32" o:spid="_x0000_s1026" style="position:absolute;z-index:251678720;visibility:visible;mso-wrap-style:square;mso-wrap-distance-left:9pt;mso-wrap-distance-top:0;mso-wrap-distance-right:9pt;mso-wrap-distance-bottom:0;mso-position-horizontal:absolute;mso-position-horizontal-relative:text;mso-position-vertical:absolute;mso-position-vertical-relative:text" from="-.35pt,6.45pt" to="558.05pt,6.45pt" o:gfxdata="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" strokecolor="#cbcfd4" strokeweight="3pt">
-                      <v:stroke joinstyle="miter"/>
-                    </v:line>
-                  </w:pict>
-                </mc:Fallback>
-              </mc:AlternateContent>
             </w:r>
           </w:p>
           <w:p>
@@ -2858,25 +2776,9 @@
       <w:pPr>
         <w:spacing w:after="0" w:line="240" w:lineRule="auto"/>
         <w:rPr>
-          <w:rFonts w:ascii="Playfair Display" w:hAnsi="Playfair Display" w:cs="Times New Roman (Body CS)"/>
-          <w:b/>
-          <w:bCs/>
-          <w:color w:val="1588CF"/>
-          <w:sz w:val="28"/>
-          <w:szCs w:val="28"/>
+          <w:sz w:val="2"/>
+          <w:szCs w:val="2"/>
         </w:rPr>
-        <w:sectPr>
-          <w:headerReference w:type="even" r:id="rId12"/>
-          <w:headerReference w:type="default" r:id="rId13"/>
-          <w:footerReference w:type="even" r:id="rId14"/>
-          <w:footerReference w:type="default" r:id="rId15"/>
-          <w:headerReference w:type="first" r:id="rId16"/>
-          <w:footerReference w:type="first" r:id="rId17"/>
-          <w:pgSz w:w="11906" w:h="16838" w:code="9"/>
-          <w:pgMar w:top="284" w:right="454" w:bottom="284" w:left="454" w:header="0" w:footer="0" w:gutter="0"/>
-          <w:cols w:space="518"/>
-          <w:docGrid w:linePitch="360"/>
-        </w:sectPr>
       </w:pPr>
       <w:r>
         <w:rPr>
@@ -2892,7 +2794,173 @@
         <mc:AlternateContent>
           <mc:Choice Requires="wps">
             <w:drawing>
-              <wp:anchor distT="0" distB="0" distL="114300" distR="114300" simplePos="0" relativeHeight="251671552" behindDoc="0" locked="0" layoutInCell="1" allowOverlap="1" wp14:anchorId="54D2C888" wp14:editId="5C0214C1">
+              <wp:anchor distT="0" distB="0" distL="114300" distR="114300" simplePos="0" relativeHeight="251684864" behindDoc="0" locked="0" layoutInCell="1" allowOverlap="1" wp14:anchorId="5C1493CB" wp14:editId="3B563A5E">
+                <wp:simplePos x="0" y="0"/>
+                <wp:positionH relativeFrom="column">
+                  <wp:posOffset>-36195</wp:posOffset>
+                </wp:positionH>
+                <wp:positionV relativeFrom="paragraph">
+                  <wp:posOffset>46355</wp:posOffset>
+                </wp:positionV>
+                <wp:extent cx="7113270" cy="0"/>
+                <wp:effectExtent l="0" t="19050" r="49530" b="38100"/>
+                <wp:wrapNone/>
+                <wp:docPr id="2" name="Straight Connector 32">
+                  <a:extLst xmlns:a="http://schemas.openxmlformats.org/drawingml/2006/main">
+                    <a:ext uri="{C183D7F6-B498-43B3-948B-1728B52AA6E4}">
+                      <adec:decorative xmlns:adec="http://schemas.microsoft.com/office/drawing/2017/decorative" val="1"/>
+                    </a:ext>
+                  </a:extLst>
+                </wp:docPr>
+                <wp:cNvGraphicFramePr/>
+                <a:graphic xmlns:a="http://schemas.openxmlformats.org/drawingml/2006/main">
+                  <a:graphicData uri="http://schemas.microsoft.com/office/word/2010/wordprocessingShape">
+                    <wps:wsp>
+                      <wps:cNvCnPr/>
+                      <wps:spPr>
+                        <a:xfrm>
+                          <a:off x="0" y="0"/>
+                          <a:ext cx="7113270" cy="0"/>
+                        </a:xfrm>
+                        <a:prstGeom prst="line">
+                          <a:avLst/>
+                        </a:prstGeom>
+                        <a:ln w="47625" cmpd="thinThick">
+                          <a:solidFill>
+                            <a:srgbClr val="1588CF"/>
+                          </a:solidFill>
+                        </a:ln>
+                      </wps:spPr>
+                      <wps:style>
+                        <a:lnRef idx="2">
+                          <a:schemeClr val="accent1"/>
+                        </a:lnRef>
+                        <a:fillRef idx="0">
+                          <a:schemeClr val="accent1"/>
+                        </a:fillRef>
+                        <a:effectRef idx="1">
+                          <a:schemeClr val="accent1"/>
+                        </a:effectRef>
+                        <a:fontRef idx="minor">
+                          <a:schemeClr val="tx1"/>
+                        </a:fontRef>
+                      </wps:style>
+                      <wps:bodyPr/>
+                    </wps:wsp>
+                  </a:graphicData>
+                </a:graphic>
+                <wp14:sizeRelH relativeFrom="margin">
+                  <wp14:pctWidth>0</wp14:pctWidth>
+                </wp14:sizeRelH>
+                <wp14:sizeRelV relativeFrom="margin">
+                  <wp14:pctHeight>0</wp14:pctHeight>
+                </wp14:sizeRelV>
+              </wp:anchor>
+            </w:drawing>
+          </mc:Choice>
+          <mc:Fallback>
+            <w:pict>
+              <v:line w14:anchorId="31A79B91" id="Straight Connector 32" o:spid="_x0000_s1026" alt="&quot;&quot;" style="position:absolute;z-index:251684864;visibility:visible;mso-wrap-style:square;mso-width-percent:0;mso-height-percent:0;mso-wrap-distance-left:9pt;mso-wrap-distance-top:0;mso-wrap-distance-right:9pt;mso-wrap-distance-bottom:0;mso-position-horizontal:absolute;mso-position-horizontal-relative:text;mso-position-vertical:absolute;mso-position-vertical-relative:text;mso-width-percent:0;mso-height-percent:0;mso-width-relative:margin;mso-height-relative:margin" from="-2.85pt,3.65pt" to="557.25pt,3.65pt" o:gfxdata="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" strokecolor="#1588cf" strokeweight="3.75pt">
+                <v:stroke linestyle="thinThick" joinstyle="miter"/>
+              </v:line>
+            </w:pict>
+          </mc:Fallback>
+        </mc:AlternateContent>
+      </w:r>
+      <w:r>
+        <w:rPr>
+          <w:rFonts w:cs="Times New Roman (Body CS)"/>
+          <w:b/>
+          <w:bCs/>
+          <w:noProof/>
+          <w:color w:val="81311A"/>
+          <w:sz w:val="28"/>
+          <w:szCs w:val="28"/>
+        </w:rPr>
+        <mc:AlternateContent>
+          <mc:Choice Requires="wps">
+            <w:drawing>
+              <wp:anchor distT="0" distB="0" distL="114300" distR="114300" simplePos="0" relativeHeight="251678720" behindDoc="0" locked="0" layoutInCell="1" allowOverlap="1" wp14:anchorId="5F80219F" wp14:editId="1FFB6122">
+                <wp:simplePos x="0" y="0"/>
+                <wp:positionH relativeFrom="column">
+                  <wp:posOffset>-69215</wp:posOffset>
+                </wp:positionH>
+                <wp:positionV relativeFrom="paragraph">
+                  <wp:posOffset>-920750</wp:posOffset>
+                </wp:positionV>
+                <wp:extent cx="7091680" cy="0"/>
+                <wp:effectExtent l="0" t="19050" r="33020" b="19050"/>
+                <wp:wrapNone/>
+                <wp:docPr id="1605575555" name="Straight Connector 32">
+                  <a:extLst xmlns:a="http://schemas.openxmlformats.org/drawingml/2006/main">
+                    <a:ext uri="{C183D7F6-B498-43B3-948B-1728B52AA6E4}">
+                      <adec:decorative xmlns:adec="http://schemas.microsoft.com/office/drawing/2017/decorative" val="1"/>
+                    </a:ext>
+                  </a:extLst>
+                </wp:docPr>
+                <wp:cNvGraphicFramePr/>
+                <a:graphic xmlns:a="http://schemas.openxmlformats.org/drawingml/2006/main">
+                  <a:graphicData uri="http://schemas.microsoft.com/office/word/2010/wordprocessingShape">
+                    <wps:wsp>
+                      <wps:cNvCnPr/>
+                      <wps:spPr>
+                        <a:xfrm>
+                          <a:off x="0" y="0"/>
+                          <a:ext cx="7091680" cy="0"/>
+                        </a:xfrm>
+                        <a:prstGeom prst="line">
+                          <a:avLst/>
+                        </a:prstGeom>
+                        <a:ln w="38100">
+                          <a:solidFill>
+                            <a:srgbClr val="CBCFD4"/>
+                          </a:solidFill>
+                        </a:ln>
+                      </wps:spPr>
+                      <wps:style>
+                        <a:lnRef idx="2">
+                          <a:schemeClr val="accent1"/>
+                        </a:lnRef>
+                        <a:fillRef idx="0">
+                          <a:schemeClr val="accent1"/>
+                        </a:fillRef>
+                        <a:effectRef idx="1">
+                          <a:schemeClr val="accent1"/>
+                        </a:effectRef>
+                        <a:fontRef idx="minor">
+                          <a:schemeClr val="tx1"/>
+                        </a:fontRef>
+                      </wps:style>
+                      <wps:bodyPr/>
+                    </wps:wsp>
+                  </a:graphicData>
+                </a:graphic>
+              </wp:anchor>
+            </w:drawing>
+          </mc:Choice>
+          <mc:Fallback>
+            <w:pict>
+              <v:line w14:anchorId="6ED70BD9" id="Straight Connector 32" o:spid="_x0000_s1026" alt="&quot;&quot;" style="position:absolute;z-index:251678720;visibility:visible;mso-wrap-style:square;mso-wrap-distance-left:9pt;mso-wrap-distance-top:0;mso-wrap-distance-right:9pt;mso-wrap-distance-bottom:0;mso-position-horizontal:absolute;mso-position-horizontal-relative:text;mso-position-vertical:absolute;mso-position-vertical-relative:text" from="-5.45pt,-72.5pt" to="552.95pt,-72.5pt" o:gfxdata="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" strokecolor="#cbcfd4" strokeweight="3pt">
+                <v:stroke joinstyle="miter"/>
+              </v:line>
+            </w:pict>
+          </mc:Fallback>
+        </mc:AlternateContent>
+      </w:r>
+      <w:r>
+        <w:rPr>
+          <w:rFonts w:cs="Times New Roman (Body CS)"/>
+          <w:b/>
+          <w:bCs/>
+          <w:noProof/>
+          <w:color w:val="81311A"/>
+          <w:sz w:val="28"/>
+          <w:szCs w:val="28"/>
+        </w:rPr>
+        <mc:AlternateContent>
+          <mc:Choice Requires="wps">
+            <w:drawing>
+              <wp:anchor distT="0" distB="0" distL="114300" distR="114300" simplePos="0" relativeHeight="251671552" behindDoc="0" locked="0" layoutInCell="1" allowOverlap="1" wp14:anchorId="54D2C888" wp14:editId="5C0A104D">
                 <wp:simplePos x="0" y="0"/>
                 <wp:positionH relativeFrom="column">
                   <wp:posOffset>-63661</wp:posOffset>
@@ -2903,7 +2971,13 @@
                 <wp:extent cx="7091680" cy="0"/>
                 <wp:effectExtent l="0" t="19050" r="33020" b="19050"/>
                 <wp:wrapNone/>
-                <wp:docPr id="1700265441" name="Straight Connector 32"/>
+                <wp:docPr id="1700265441" name="Straight Connector 32">
+                  <a:extLst xmlns:a="http://schemas.openxmlformats.org/drawingml/2006/main">
+                    <a:ext uri="{C183D7F6-B498-43B3-948B-1728B52AA6E4}">
+                      <adec:decorative xmlns:adec="http://schemas.microsoft.com/office/drawing/2017/decorative" val="1"/>
+                    </a:ext>
+                  </a:extLst>
+                </wp:docPr>
                 <wp:cNvGraphicFramePr/>
                 <a:graphic xmlns:a="http://schemas.openxmlformats.org/drawingml/2006/main">
                   <a:graphicData uri="http://schemas.microsoft.com/office/word/2010/wordprocessingShape">
@@ -2949,7 +3023,7 @@
           </mc:Choice>
           <mc:Fallback>
             <w:pict>
-              <v:line w14:anchorId="0EDD786F" id="Straight Connector 32" o:spid="_x0000_s1026" style="position:absolute;z-index:251671552;visibility:visible;mso-wrap-style:square;mso-width-percent:0;mso-wrap-distance-left:9pt;mso-wrap-distance-top:0;mso-wrap-distance-right:9pt;mso-wrap-distance-bottom:0;mso-position-horizontal:absolute;mso-position-horizontal-relative:text;mso-position-vertical:absolute;mso-position-vertical-relative:text;mso-width-percent:0;mso-width-relative:margin" from="-5pt,-499.35pt" to="553.4pt,-499.35pt" o:gfxdata="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" strokecolor="#cbcfd4" strokeweight="3pt">
+              <v:line w14:anchorId="757F7602" id="Straight Connector 32" o:spid="_x0000_s1026" alt="&quot;&quot;" style="position:absolute;z-index:251671552;visibility:visible;mso-wrap-style:square;mso-width-percent:0;mso-wrap-distance-left:9pt;mso-wrap-distance-top:0;mso-wrap-distance-right:9pt;mso-wrap-distance-bottom:0;mso-position-horizontal:absolute;mso-position-horizontal-relative:text;mso-position-vertical:absolute;mso-position-vertical-relative:text;mso-width-percent:0;mso-width-relative:margin" from="-5pt,-499.35pt" to="553.4pt,-499.35pt" o:gfxdata="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" strokecolor="#cbcfd4" strokeweight="3pt">
                 <v:stroke joinstyle="miter"/>
               </v:line>
             </w:pict>
@@ -2957,299 +3031,13 @@
         </mc:AlternateContent>
       </w:r>
     </w:p>
-    <w:p>
-      <w:pPr>
-        <w:ind w:left="142"/>
-        <w:rPr>
-          <w:sz w:val="20"/>
-          <w:szCs w:val="20"/>
-        </w:rPr>
-      </w:pPr>
-    </w:p>
-    <w:p>
-      <w:pPr>
-        <w:spacing w:after="0"/>
-        <w:jc w:val="center"/>
-        <w:rPr>
-          <w:sz w:val="32"/>
-          <w:szCs w:val="32"/>
-        </w:rPr>
-      </w:pPr>
-      <w:r>
-        <w:rPr>
-          <w:rFonts w:ascii="Playfair Display" w:hAnsi="Playfair Display" w:cs="Times New Roman (Body CS)"/>
-          <w:b/>
-          <w:bCs/>
-          <w:color w:val="1588CF"/>
-          <w:sz w:val="32"/>
-          <w:szCs w:val="32"/>
-        </w:rPr>
-        <w:t>DETAILED CURRICULUM VITAE</w:t>
-      </w:r>
-    </w:p>
-    <w:p>
-      <w:pPr>
-        <w:rPr>
-          <w:rFonts w:ascii="Inter 18pt 18pt" w:hAnsi="Inter 18pt 18pt" w:cs="Times New Roman (Body CS)"/>
-          <w:b/>
-          <w:bCs/>
-          <w:color w:val="81311A"/>
-          <w:spacing w:val="20"/>
-          <w:sz w:val="32"/>
-          <w:szCs w:val="32"/>
-        </w:rPr>
-      </w:pPr>
-      <w:r>
-        <w:rPr>
-          <w:rFonts w:cs="Times New Roman (Body CS)"/>
-          <w:b/>
-          <w:bCs/>
-          <w:noProof/>
-          <w:color w:val="81311A"/>
-          <w:sz w:val="28"/>
-          <w:szCs w:val="28"/>
-        </w:rPr>
-        <mc:AlternateContent>
-          <mc:Choice Requires="wps">
-            <w:drawing>
-              <wp:anchor distT="0" distB="0" distL="114300" distR="114300" simplePos="0" relativeHeight="251677696" behindDoc="0" locked="0" layoutInCell="1" allowOverlap="1" wp14:anchorId="20358B28" wp14:editId="41284E14">
-                <wp:simplePos x="0" y="0"/>
-                <wp:positionH relativeFrom="column">
-                  <wp:posOffset>0</wp:posOffset>
-                </wp:positionH>
-                <wp:positionV relativeFrom="paragraph">
-                  <wp:posOffset>85090</wp:posOffset>
-                </wp:positionV>
-                <wp:extent cx="7092000" cy="0"/>
-                <wp:effectExtent l="0" t="0" r="7620" b="12700"/>
-                <wp:wrapNone/>
-                <wp:docPr id="1" name="Straight Connector 32"/>
-                <wp:cNvGraphicFramePr/>
-                <a:graphic xmlns:a="http://schemas.openxmlformats.org/drawingml/2006/main">
-                  <a:graphicData uri="http://schemas.microsoft.com/office/word/2010/wordprocessingShape">
-                    <wps:wsp>
-                      <wps:cNvCnPr/>
-                      <wps:spPr>
-                        <a:xfrm>
-                          <a:off x="0" y="0"/>
-                          <a:ext cx="7092000" cy="0"/>
-                        </a:xfrm>
-                        <a:prstGeom prst="line">
-                          <a:avLst/>
-                        </a:prstGeom>
-                        <a:ln w="9525">
-                          <a:solidFill>
-                            <a:srgbClr val="CBCFD4"/>
-                          </a:solidFill>
-                        </a:ln>
-                      </wps:spPr>
-                      <wps:style>
-                        <a:lnRef idx="2">
-                          <a:schemeClr val="accent1"/>
-                        </a:lnRef>
-                        <a:fillRef idx="0">
-                          <a:schemeClr val="accent1"/>
-                        </a:fillRef>
-                        <a:effectRef idx="1">
-                          <a:schemeClr val="accent1"/>
-                        </a:effectRef>
-                        <a:fontRef idx="minor">
-                          <a:schemeClr val="tx1"/>
-                        </a:fontRef>
-                      </wps:style>
-                      <wps:bodyPr/>
-                    </wps:wsp>
-                  </a:graphicData>
-                </a:graphic>
-                <wp14:sizeRelH relativeFrom="margin">
-                  <wp14:pctWidth>0</wp14:pctWidth>
-                </wp14:sizeRelH>
-              </wp:anchor>
-            </w:drawing>
-          </mc:Choice>
-          <mc:Fallback>
-            <w:pict>
-              <v:line w14:anchorId="74AC1843" id="Straight Connector 32" o:spid="_x0000_s1026" style="position:absolute;z-index:251677696;visibility:visible;mso-wrap-style:square;mso-width-percent:0;mso-wrap-distance-left:9pt;mso-wrap-distance-top:0;mso-wrap-distance-right:9pt;mso-wrap-distance-bottom:0;mso-position-horizontal:absolute;mso-position-horizontal-relative:text;mso-position-vertical:absolute;mso-position-vertical-relative:text;mso-width-percent:0;mso-width-relative:margin" from="0,6.7pt" to="558.45pt,6.7pt" o:gfxdata="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" strokecolor="#cbcfd4">
-                <v:stroke joinstyle="miter"/>
-              </v:line>
-            </w:pict>
-          </mc:Fallback>
-        </mc:AlternateContent>
-      </w:r>
-    </w:p>
-    <w:p>
-      <w:pPr>
-        <w:rPr>
-          <w:sz w:val="20"/>
-          <w:szCs w:val="20"/>
-        </w:rPr>
-      </w:pPr>
-      <w:r>
-        <w:rPr>
-          <w:sz w:val="20"/>
-          <w:szCs w:val="20"/>
-        </w:rPr>
-        <w:t>As an electronics engineer, I apply my knowledge and skills to design, develop, and administer solutions for networking and telecommunications setups. I work with a diverse and collaborative team of engineers, technicians, and managers to keep my organization's networks at utmost readiness. I graduated from NUST with a bachelor's degree in Avionics Engineering in October 2022, where I learned the fundamentals and applications of avionics engineering, such as navigation, communication, surveillance, flight control, and electronic warfare systems. I also enhanced my programming, IT, and web development skills by self-paced learning techniques. I am passionate about learning new technologies and languages, and I am always eager to take on new challenges and opportunities.</w:t>
-      </w:r>
-    </w:p>
-    <w:p>
-      <w:pPr>
-        <w:rPr>
-          <w:sz w:val="20"/>
-          <w:szCs w:val="20"/>
-        </w:rPr>
-      </w:pPr>
-    </w:p>
-    <w:p>
-      <w:pPr>
-        <w:rPr>
-          <w:sz w:val="20"/>
-          <w:szCs w:val="20"/>
-        </w:rPr>
-      </w:pPr>
-      <w:r>
-        <w:rPr>
-          <w:sz w:val="20"/>
-          <w:szCs w:val="20"/>
-        </w:rPr>
-        <w:t xml:space="preserve">Education National University of Sciences and Technology (NUST) Bachelor of Engineering - BE, Avionics Maintenance Technology/ Technician · (November 2018 - October 2022) </w:t>
-      </w:r>
-    </w:p>
-    <w:p>
-      <w:pPr>
-        <w:rPr>
-          <w:sz w:val="20"/>
-          <w:szCs w:val="20"/>
-        </w:rPr>
-      </w:pPr>
-      <w:r>
-        <w:rPr>
-          <w:sz w:val="20"/>
-          <w:szCs w:val="20"/>
-        </w:rPr>
-        <w:t>PAF College Sargodha F. Sc (Pre-</w:t>
-      </w:r>
-      <w:proofErr w:type="spellStart"/>
-      <w:r>
-        <w:rPr>
-          <w:sz w:val="20"/>
-          <w:szCs w:val="20"/>
-        </w:rPr>
-        <w:t>Engg</w:t>
-      </w:r>
-      <w:proofErr w:type="spellEnd"/>
-      <w:r>
-        <w:rPr>
-          <w:sz w:val="20"/>
-          <w:szCs w:val="20"/>
-        </w:rPr>
-        <w:t>), Theoretical and Mathematical Physics · (April 2013 - July 2018</w:t>
-      </w:r>
-    </w:p>
-    <w:p>
-      <w:r>
-        <w:br w:type="page"/>
-      </w:r>
-    </w:p>
-    <w:p>
-      <w:pPr>
-        <w:jc w:val="center"/>
-        <w:rPr>
-          <w:sz w:val="20"/>
-          <w:szCs w:val="20"/>
-        </w:rPr>
-      </w:pPr>
-      <w:r>
-        <w:rPr>
-          <w:noProof/>
-          <w:sz w:val="20"/>
-          <w:szCs w:val="20"/>
-        </w:rPr>
-        <w:lastRenderedPageBreak/>
-        <w:drawing>
-          <wp:inline distT="0" distB="0" distL="0" distR="0" wp14:anchorId="25C74C44" wp14:editId="67894C53">
-            <wp:extent cx="6266447" cy="8860221"/>
-            <wp:effectExtent l="0" t="0" r="1270" b="0"/>
-            <wp:docPr id="5" name="Picture 5"/>
-            <wp:cNvGraphicFramePr>
-              <a:graphicFrameLocks xmlns:a="http://schemas.openxmlformats.org/drawingml/2006/main" noChangeAspect="1"/>
-            </wp:cNvGraphicFramePr>
-            <a:graphic xmlns:a="http://schemas.openxmlformats.org/drawingml/2006/main">
-              <a:graphicData uri="http://schemas.openxmlformats.org/drawingml/2006/picture">
-                <pic:pic xmlns:pic="http://schemas.openxmlformats.org/drawingml/2006/picture">
-                  <pic:nvPicPr>
-                    <pic:cNvPr id="5" name="Picture 5"/>
-                    <pic:cNvPicPr/>
-                  </pic:nvPicPr>
-                  <pic:blipFill>
-                    <a:blip r:embed="rId18" cstate="print">
-                      <a:extLst>
-                        <a:ext uri="{28A0092B-C50C-407E-A947-70E740481C1C}">
-                          <a14:useLocalDpi xmlns:a14="http://schemas.microsoft.com/office/drawing/2010/main" val="0"/>
-                        </a:ext>
-                      </a:extLst>
-                    </a:blip>
-                    <a:stretch>
-                      <a:fillRect/>
-                    </a:stretch>
-                  </pic:blipFill>
-                  <pic:spPr>
-                    <a:xfrm>
-                      <a:off x="0" y="0"/>
-                      <a:ext cx="6281941" cy="8882128"/>
-                    </a:xfrm>
-                    <a:prstGeom prst="rect">
-                      <a:avLst/>
-                    </a:prstGeom>
-                  </pic:spPr>
-                </pic:pic>
-              </a:graphicData>
-            </a:graphic>
-          </wp:inline>
-        </w:drawing>
-      </w:r>
-    </w:p>
-    <w:p>
-      <w:pPr>
-        <w:rPr>
-          <w:sz w:val="2"/>
-          <w:szCs w:val="2"/>
-        </w:rPr>
-      </w:pPr>
-    </w:p>
-    <w:p>
-      <w:pPr>
-        <w:rPr>
-          <w:sz w:val="2"/>
-          <w:szCs w:val="2"/>
-        </w:rPr>
-      </w:pPr>
-    </w:p>
-    <w:p>
-      <w:pPr>
-        <w:rPr>
-          <w:sz w:val="2"/>
-          <w:szCs w:val="2"/>
-        </w:rPr>
-      </w:pPr>
-    </w:p>
-    <w:p>
-      <w:pPr>
-        <w:rPr>
-          <w:sz w:val="2"/>
-          <w:szCs w:val="2"/>
-        </w:rPr>
-      </w:pPr>
-    </w:p>
-    <w:p>
-      <w:pPr>
-        <w:rPr>
-          <w:sz w:val="2"/>
-          <w:szCs w:val="2"/>
-        </w:rPr>
-      </w:pPr>
-    </w:p>
     <w:sectPr>
+      <w:headerReference w:type="even" r:id="rId12"/>
+      <w:headerReference w:type="default" r:id="rId13"/>
+      <w:footerReference w:type="even" r:id="rId14"/>
+      <w:footerReference w:type="default" r:id="rId15"/>
+      <w:headerReference w:type="first" r:id="rId16"/>
+      <w:footerReference w:type="first" r:id="rId17"/>
       <w:pgSz w:w="11906" w:h="16838" w:code="9"/>
       <w:pgMar w:top="284" w:right="454" w:bottom="284" w:left="454" w:header="0" w:footer="0" w:gutter="0"/>
       <w:cols w:space="708"/>

</xml_diff>